<commit_message>
chore: save current workspace code
</commit_message>
<xml_diff>
--- a/resource/相关文档/批记录无纸化系统V1-CRD.docx
+++ b/resource/相关文档/批记录无纸化系统V1-CRD.docx
@@ -66,9 +66,9 @@
         </w:tblCellMar>
       </w:tblPr>
       <w:tblGrid>
-        <w:gridCol w:w="899"/>
-        <w:gridCol w:w="2257"/>
-        <w:gridCol w:w="11868"/>
+        <w:gridCol w:w="702"/>
+        <w:gridCol w:w="2288"/>
+        <w:gridCol w:w="12034"/>
       </w:tblGrid>
       <w:tr>
         <w:tblPrEx>
@@ -617,7 +617,7 @@
           <w:b/>
           <w:sz w:val="28"/>
         </w:rPr>
-        <w:t xml:space="preserve">01 主数据与配置管理</w:t>
+        <w:t>01 主数据与配置管理</w:t>
       </w:r>
     </w:p>
     <w:tbl>
@@ -642,12 +642,12 @@
         </w:tblCellMar>
       </w:tblPr>
       <w:tblGrid>
-        <w:gridCol w:w="2454"/>
-        <w:gridCol w:w="2871"/>
-        <w:gridCol w:w="1952"/>
-        <w:gridCol w:w="1526"/>
-        <w:gridCol w:w="4013"/>
-        <w:gridCol w:w="943"/>
+        <w:gridCol w:w="2487"/>
+        <w:gridCol w:w="2924"/>
+        <w:gridCol w:w="1980"/>
+        <w:gridCol w:w="1537"/>
+        <w:gridCol w:w="4087"/>
+        <w:gridCol w:w="744"/>
       </w:tblGrid>
       <w:tr>
         <w:tblPrEx>
@@ -659,6 +659,12 @@
             <w:insideH w:val="single" w:color="auto" w:sz="4" w:space="0"/>
             <w:insideV w:val="single" w:color="auto" w:sz="4" w:space="0"/>
           </w:tblBorders>
+          <w:tblCellMar>
+            <w:top w:w="0" w:type="dxa"/>
+            <w:left w:w="10" w:type="dxa"/>
+            <w:bottom w:w="0" w:type="dxa"/>
+            <w:right w:w="10" w:type="dxa"/>
+          </w:tblCellMar>
         </w:tblPrEx>
         <w:tc>
           <w:p>
@@ -722,6 +728,614 @@
         </w:tblPrEx>
         <w:tc>
           <w:p>
+            <w:pPr>
+              <w:rPr>
+                <w:rFonts w:hint="default" w:eastAsia="微软雅黑"/>
+                <w:lang w:val="en-US" w:eastAsia="zh-CN"/>
+              </w:rPr>
+            </w:pPr>
+            <w:r>
+              <w:t>CR-00</w:t>
+            </w:r>
+            <w:r>
+              <w:rPr>
+                <w:rFonts w:hint="eastAsia"/>
+                <w:lang w:val="en-US" w:eastAsia="zh-CN"/>
+              </w:rPr>
+              <w:t>1 可以在车间运行这个产品</w:t>
+            </w:r>
+          </w:p>
+        </w:tc>
+        <w:tc>
+          <w:p>
+            <w:pPr>
+              <w:rPr>
+                <w:rFonts w:hint="default" w:eastAsia="微软雅黑"/>
+                <w:lang w:val="en-US" w:eastAsia="zh-CN"/>
+              </w:rPr>
+            </w:pPr>
+            <w:r>
+              <w:rPr>
+                <w:rFonts w:hint="eastAsia"/>
+                <w:lang w:val="en-US" w:eastAsia="zh-CN"/>
+              </w:rPr>
+              <w:t>在车间内按照系统的流程运行起来一个月</w:t>
+            </w:r>
+          </w:p>
+        </w:tc>
+        <w:tc>
+          <w:p>
+            <w:pPr>
+              <w:rPr>
+                <w:rFonts w:hint="eastAsia" w:eastAsia="微软雅黑"/>
+                <w:lang w:val="en-US" w:eastAsia="zh-CN"/>
+              </w:rPr>
+            </w:pPr>
+            <w:r>
+              <w:rPr>
+                <w:rFonts w:hint="eastAsia"/>
+                <w:lang w:val="en-US" w:eastAsia="zh-CN"/>
+              </w:rPr>
+              <w:t>/</w:t>
+            </w:r>
+          </w:p>
+        </w:tc>
+        <w:tc>
+          <w:p>
+            <w:pPr>
+              <w:rPr>
+                <w:rFonts w:hint="eastAsia"/>
+                <w:lang w:val="en-US" w:eastAsia="zh-CN"/>
+              </w:rPr>
+            </w:pPr>
+            <w:r>
+              <w:rPr>
+                <w:rFonts w:hint="eastAsia"/>
+                <w:lang w:val="en-US" w:eastAsia="zh-CN"/>
+              </w:rPr>
+              <w:t>一线生产</w:t>
+            </w:r>
+          </w:p>
+          <w:p>
+            <w:pPr>
+              <w:rPr>
+                <w:rFonts w:hint="eastAsia"/>
+                <w:lang w:val="en-US" w:eastAsia="zh-CN"/>
+              </w:rPr>
+            </w:pPr>
+            <w:r>
+              <w:rPr>
+                <w:rFonts w:hint="eastAsia"/>
+                <w:lang w:val="en-US" w:eastAsia="zh-CN"/>
+              </w:rPr>
+              <w:t>一线检验员</w:t>
+            </w:r>
+          </w:p>
+          <w:p>
+            <w:pPr>
+              <w:rPr>
+                <w:rFonts w:hint="eastAsia"/>
+                <w:lang w:val="en-US" w:eastAsia="zh-CN"/>
+              </w:rPr>
+            </w:pPr>
+            <w:r>
+              <w:rPr>
+                <w:rFonts w:hint="eastAsia"/>
+                <w:lang w:val="en-US" w:eastAsia="zh-CN"/>
+              </w:rPr>
+              <w:t>QA</w:t>
+            </w:r>
+          </w:p>
+          <w:p>
+            <w:pPr>
+              <w:rPr>
+                <w:rFonts w:hint="eastAsia"/>
+                <w:lang w:val="en-US" w:eastAsia="zh-CN"/>
+              </w:rPr>
+            </w:pPr>
+            <w:r>
+              <w:rPr>
+                <w:rFonts w:hint="eastAsia"/>
+                <w:lang w:val="en-US" w:eastAsia="zh-CN"/>
+              </w:rPr>
+              <w:t>灭菌站</w:t>
+            </w:r>
+          </w:p>
+          <w:p>
+            <w:pPr>
+              <w:rPr>
+                <w:rFonts w:hint="eastAsia"/>
+                <w:lang w:val="en-US" w:eastAsia="zh-CN"/>
+              </w:rPr>
+            </w:pPr>
+            <w:r>
+              <w:rPr>
+                <w:rFonts w:hint="eastAsia"/>
+                <w:lang w:val="en-US" w:eastAsia="zh-CN"/>
+              </w:rPr>
+              <w:t>成品检</w:t>
+            </w:r>
+          </w:p>
+          <w:p>
+            <w:pPr>
+              <w:rPr>
+                <w:rFonts w:hint="eastAsia"/>
+                <w:lang w:val="en-US" w:eastAsia="zh-CN"/>
+              </w:rPr>
+            </w:pPr>
+            <w:r>
+              <w:rPr>
+                <w:rFonts w:hint="eastAsia"/>
+                <w:lang w:val="en-US" w:eastAsia="zh-CN"/>
+              </w:rPr>
+              <w:t>管代授权人</w:t>
+            </w:r>
+          </w:p>
+          <w:p>
+            <w:pPr>
+              <w:rPr>
+                <w:rFonts w:hint="eastAsia"/>
+                <w:lang w:val="en-US" w:eastAsia="zh-CN"/>
+              </w:rPr>
+            </w:pPr>
+            <w:r>
+              <w:rPr>
+                <w:rFonts w:hint="eastAsia"/>
+                <w:lang w:val="en-US" w:eastAsia="zh-CN"/>
+              </w:rPr>
+              <w:t>PQC负责人</w:t>
+            </w:r>
+          </w:p>
+          <w:p>
+            <w:pPr>
+              <w:rPr>
+                <w:rFonts w:hint="default"/>
+                <w:lang w:val="en-US" w:eastAsia="zh-CN"/>
+              </w:rPr>
+            </w:pPr>
+            <w:r>
+              <w:rPr>
+                <w:rFonts w:hint="eastAsia"/>
+                <w:lang w:val="en-US" w:eastAsia="zh-CN"/>
+              </w:rPr>
+              <w:t>IT</w:t>
+            </w:r>
+          </w:p>
+        </w:tc>
+        <w:tc>
+          <w:p>
+            <w:pPr>
+              <w:numPr>
+                <w:ilvl w:val="0"/>
+                <w:numId w:val="1"/>
+              </w:numPr>
+              <w:rPr>
+                <w:rFonts w:hint="eastAsia"/>
+                <w:lang w:val="en-US" w:eastAsia="zh-CN"/>
+              </w:rPr>
+            </w:pPr>
+            <w:r>
+              <w:rPr>
+                <w:rFonts w:hint="eastAsia"/>
+                <w:lang w:val="en-US" w:eastAsia="zh-CN"/>
+              </w:rPr>
+              <w:t>一线生产员工可以通过报工形成生产记录</w:t>
+            </w:r>
+          </w:p>
+          <w:p>
+            <w:pPr>
+              <w:numPr>
+                <w:ilvl w:val="0"/>
+                <w:numId w:val="1"/>
+              </w:numPr>
+              <w:rPr>
+                <w:rFonts w:hint="default"/>
+                <w:lang w:val="en-US" w:eastAsia="zh-CN"/>
+              </w:rPr>
+            </w:pPr>
+            <w:r>
+              <w:rPr>
+                <w:rFonts w:hint="eastAsia"/>
+                <w:lang w:val="en-US" w:eastAsia="zh-CN"/>
+              </w:rPr>
+              <w:t>一线检验员可以填写检验记录</w:t>
+            </w:r>
+          </w:p>
+          <w:p>
+            <w:pPr>
+              <w:numPr>
+                <w:ilvl w:val="0"/>
+                <w:numId w:val="1"/>
+              </w:numPr>
+              <w:rPr>
+                <w:rFonts w:hint="default"/>
+                <w:lang w:val="en-US" w:eastAsia="zh-CN"/>
+              </w:rPr>
+            </w:pPr>
+            <w:r>
+              <w:rPr>
+                <w:rFonts w:hint="eastAsia"/>
+                <w:lang w:val="en-US" w:eastAsia="zh-CN"/>
+              </w:rPr>
+              <w:t>QA可以更改批记录模板,QA检验规程</w:t>
+            </w:r>
+          </w:p>
+          <w:p>
+            <w:pPr>
+              <w:numPr>
+                <w:ilvl w:val="0"/>
+                <w:numId w:val="1"/>
+              </w:numPr>
+              <w:rPr>
+                <w:rFonts w:hint="default"/>
+                <w:lang w:val="en-US" w:eastAsia="zh-CN"/>
+              </w:rPr>
+            </w:pPr>
+            <w:r>
+              <w:rPr>
+                <w:rFonts w:hint="eastAsia"/>
+                <w:lang w:val="en-US" w:eastAsia="zh-CN"/>
+              </w:rPr>
+              <w:t>灭菌和成品检可以上传对应的记录和报告</w:t>
+            </w:r>
+          </w:p>
+          <w:p>
+            <w:pPr>
+              <w:numPr>
+                <w:ilvl w:val="0"/>
+                <w:numId w:val="1"/>
+              </w:numPr>
+              <w:rPr>
+                <w:rFonts w:hint="default"/>
+                <w:lang w:val="en-US" w:eastAsia="zh-CN"/>
+              </w:rPr>
+            </w:pPr>
+            <w:r>
+              <w:rPr>
+                <w:rFonts w:hint="eastAsia"/>
+                <w:lang w:val="en-US" w:eastAsia="zh-CN"/>
+              </w:rPr>
+              <w:t>PQC负责人可以进行生产放行</w:t>
+            </w:r>
+          </w:p>
+          <w:p>
+            <w:pPr>
+              <w:numPr>
+                <w:ilvl w:val="0"/>
+                <w:numId w:val="1"/>
+              </w:numPr>
+              <w:rPr>
+                <w:rFonts w:hint="default"/>
+                <w:lang w:val="en-US" w:eastAsia="zh-CN"/>
+              </w:rPr>
+            </w:pPr>
+            <w:r>
+              <w:rPr>
+                <w:rFonts w:hint="eastAsia"/>
+                <w:lang w:val="en-US" w:eastAsia="zh-CN"/>
+              </w:rPr>
+              <w:t>管代可以进行上市放行</w:t>
+            </w:r>
+          </w:p>
+          <w:p>
+            <w:pPr>
+              <w:numPr>
+                <w:ilvl w:val="0"/>
+                <w:numId w:val="1"/>
+              </w:numPr>
+              <w:rPr>
+                <w:rFonts w:hint="default"/>
+                <w:lang w:val="en-US" w:eastAsia="zh-CN"/>
+              </w:rPr>
+            </w:pPr>
+            <w:r>
+              <w:rPr>
+                <w:rFonts w:hint="eastAsia"/>
+                <w:lang w:val="en-US" w:eastAsia="zh-CN"/>
+              </w:rPr>
+              <w:t>所有的操作都有记录</w:t>
+            </w:r>
+          </w:p>
+          <w:p>
+            <w:pPr>
+              <w:numPr>
+                <w:ilvl w:val="0"/>
+                <w:numId w:val="1"/>
+              </w:numPr>
+              <w:rPr>
+                <w:rFonts w:hint="default"/>
+                <w:lang w:val="en-US" w:eastAsia="zh-CN"/>
+              </w:rPr>
+            </w:pPr>
+            <w:r>
+              <w:rPr>
+                <w:rFonts w:hint="eastAsia"/>
+                <w:lang w:val="en-US" w:eastAsia="zh-CN"/>
+              </w:rPr>
+              <w:t>上市/作废的批次都要可以追溯</w:t>
+            </w:r>
+          </w:p>
+          <w:p>
+            <w:pPr>
+              <w:numPr>
+                <w:ilvl w:val="0"/>
+                <w:numId w:val="1"/>
+              </w:numPr>
+              <w:rPr>
+                <w:rFonts w:hint="default"/>
+                <w:lang w:val="en-US" w:eastAsia="zh-CN"/>
+              </w:rPr>
+            </w:pPr>
+            <w:r>
+              <w:rPr>
+                <w:rFonts w:hint="eastAsia"/>
+                <w:lang w:val="en-US" w:eastAsia="zh-CN"/>
+              </w:rPr>
+              <w:t>流程到了哪一步,哪一步的相关责任人手套通知</w:t>
+            </w:r>
+            <w:bookmarkStart w:id="0" w:name="_GoBack"/>
+            <w:bookmarkEnd w:id="0"/>
+          </w:p>
+        </w:tc>
+        <w:tc>
+          <w:p>
+            <w:pPr>
+              <w:rPr>
+                <w:rFonts w:hint="default" w:eastAsia="微软雅黑"/>
+                <w:lang w:val="en-US" w:eastAsia="zh-CN"/>
+              </w:rPr>
+            </w:pPr>
+            <w:r>
+              <w:rPr>
+                <w:rFonts w:hint="eastAsia"/>
+                <w:lang w:val="en-US" w:eastAsia="zh-CN"/>
+              </w:rPr>
+              <w:t>P0</w:t>
+            </w:r>
+          </w:p>
+        </w:tc>
+      </w:tr>
+      <w:tr>
+        <w:tblPrEx>
+          <w:tblBorders>
+            <w:top w:val="single" w:color="auto" w:sz="4" w:space="0"/>
+            <w:left w:val="single" w:color="auto" w:sz="4" w:space="0"/>
+            <w:bottom w:val="single" w:color="auto" w:sz="4" w:space="0"/>
+            <w:right w:val="single" w:color="auto" w:sz="4" w:space="0"/>
+            <w:insideH w:val="single" w:color="auto" w:sz="4" w:space="0"/>
+            <w:insideV w:val="single" w:color="auto" w:sz="4" w:space="0"/>
+          </w:tblBorders>
+          <w:tblCellMar>
+            <w:top w:w="0" w:type="dxa"/>
+            <w:left w:w="10" w:type="dxa"/>
+            <w:bottom w:w="0" w:type="dxa"/>
+            <w:right w:w="10" w:type="dxa"/>
+          </w:tblCellMar>
+        </w:tblPrEx>
+        <w:tc>
+          <w:p>
+            <w:pPr>
+              <w:rPr>
+                <w:rFonts w:hint="default" w:eastAsia="微软雅黑"/>
+                <w:lang w:val="en-US" w:eastAsia="zh-CN"/>
+              </w:rPr>
+            </w:pPr>
+            <w:r>
+              <w:t>CR-00</w:t>
+            </w:r>
+            <w:r>
+              <w:rPr>
+                <w:rFonts w:hint="eastAsia"/>
+                <w:lang w:val="en-US" w:eastAsia="zh-CN"/>
+              </w:rPr>
+              <w:t>2 可以做到内部合规</w:t>
+            </w:r>
+          </w:p>
+        </w:tc>
+        <w:tc>
+          <w:p>
+            <w:pPr>
+              <w:rPr>
+                <w:rFonts w:hint="default" w:eastAsia="微软雅黑"/>
+                <w:lang w:val="en-US" w:eastAsia="zh-CN"/>
+              </w:rPr>
+            </w:pPr>
+            <w:r>
+              <w:rPr>
+                <w:rFonts w:hint="eastAsia"/>
+                <w:lang w:val="en-US" w:eastAsia="zh-CN"/>
+              </w:rPr>
+              <w:t>完成内部识别出来的合规问题</w:t>
+            </w:r>
+          </w:p>
+        </w:tc>
+        <w:tc>
+          <w:p>
+            <w:pPr>
+              <w:rPr>
+                <w:rFonts w:hint="eastAsia" w:eastAsia="微软雅黑"/>
+                <w:lang w:val="en-US" w:eastAsia="zh-CN"/>
+              </w:rPr>
+            </w:pPr>
+            <w:r>
+              <w:rPr>
+                <w:rFonts w:hint="eastAsia"/>
+                <w:lang w:val="en-US" w:eastAsia="zh-CN"/>
+              </w:rPr>
+              <w:t>/</w:t>
+            </w:r>
+          </w:p>
+        </w:tc>
+        <w:tc>
+          <w:p>
+            <w:pPr>
+              <w:rPr>
+                <w:rFonts w:hint="default" w:eastAsia="微软雅黑"/>
+                <w:lang w:val="en-US" w:eastAsia="zh-CN"/>
+              </w:rPr>
+            </w:pPr>
+            <w:r>
+              <w:rPr>
+                <w:rFonts w:hint="eastAsia"/>
+                <w:lang w:val="en-US" w:eastAsia="zh-CN"/>
+              </w:rPr>
+              <w:t>体系,同CR-001</w:t>
+            </w:r>
+          </w:p>
+        </w:tc>
+        <w:tc>
+          <w:p>
+            <w:pPr>
+              <w:rPr>
+                <w:rFonts w:hint="default" w:eastAsia="微软雅黑"/>
+                <w:lang w:val="en-US" w:eastAsia="zh-CN"/>
+              </w:rPr>
+            </w:pPr>
+            <w:r>
+              <w:rPr>
+                <w:rFonts w:hint="eastAsia"/>
+                <w:lang w:val="en-US" w:eastAsia="zh-CN"/>
+              </w:rPr>
+              <w:t>识别解决内部发现的合规问题</w:t>
+            </w:r>
+          </w:p>
+        </w:tc>
+        <w:tc>
+          <w:p>
+            <w:r>
+              <w:rPr>
+                <w:rFonts w:hint="eastAsia"/>
+                <w:lang w:val="en-US" w:eastAsia="zh-CN"/>
+              </w:rPr>
+              <w:t>P1</w:t>
+            </w:r>
+          </w:p>
+        </w:tc>
+      </w:tr>
+      <w:tr>
+        <w:tblPrEx>
+          <w:tblBorders>
+            <w:top w:val="single" w:color="auto" w:sz="4" w:space="0"/>
+            <w:left w:val="single" w:color="auto" w:sz="4" w:space="0"/>
+            <w:bottom w:val="single" w:color="auto" w:sz="4" w:space="0"/>
+            <w:right w:val="single" w:color="auto" w:sz="4" w:space="0"/>
+            <w:insideH w:val="single" w:color="auto" w:sz="4" w:space="0"/>
+            <w:insideV w:val="single" w:color="auto" w:sz="4" w:space="0"/>
+          </w:tblBorders>
+          <w:tblCellMar>
+            <w:top w:w="0" w:type="dxa"/>
+            <w:left w:w="10" w:type="dxa"/>
+            <w:bottom w:w="0" w:type="dxa"/>
+            <w:right w:w="10" w:type="dxa"/>
+          </w:tblCellMar>
+        </w:tblPrEx>
+        <w:tc>
+          <w:p>
+            <w:pPr>
+              <w:rPr>
+                <w:rFonts w:hint="default" w:eastAsia="微软雅黑"/>
+                <w:lang w:val="en-US" w:eastAsia="zh-CN"/>
+              </w:rPr>
+            </w:pPr>
+            <w:r>
+              <w:t>CR-00</w:t>
+            </w:r>
+            <w:r>
+              <w:rPr>
+                <w:rFonts w:hint="eastAsia"/>
+                <w:lang w:val="en-US" w:eastAsia="zh-CN"/>
+              </w:rPr>
+              <w:t>3 可以做到外部合规</w:t>
+            </w:r>
+          </w:p>
+        </w:tc>
+        <w:tc>
+          <w:p>
+            <w:pPr>
+              <w:rPr>
+                <w:rFonts w:hint="default" w:eastAsia="微软雅黑"/>
+                <w:lang w:val="en-US" w:eastAsia="zh-CN"/>
+              </w:rPr>
+            </w:pPr>
+            <w:r>
+              <w:rPr>
+                <w:rFonts w:hint="eastAsia"/>
+                <w:lang w:val="en-US" w:eastAsia="zh-CN"/>
+              </w:rPr>
+              <w:t>完成外部提出的合规问题</w:t>
+            </w:r>
+          </w:p>
+        </w:tc>
+        <w:tc>
+          <w:p>
+            <w:pPr>
+              <w:rPr>
+                <w:rFonts w:hint="eastAsia" w:eastAsia="微软雅黑"/>
+                <w:lang w:val="en-US" w:eastAsia="zh-CN"/>
+              </w:rPr>
+            </w:pPr>
+            <w:r>
+              <w:rPr>
+                <w:rFonts w:hint="eastAsia"/>
+                <w:lang w:val="en-US" w:eastAsia="zh-CN"/>
+              </w:rPr>
+              <w:t>/</w:t>
+            </w:r>
+          </w:p>
+        </w:tc>
+        <w:tc>
+          <w:p>
+            <w:r>
+              <w:rPr>
+                <w:rFonts w:hint="eastAsia"/>
+                <w:lang w:val="en-US" w:eastAsia="zh-CN"/>
+              </w:rPr>
+              <w:t>体系,同CR-001</w:t>
+            </w:r>
+          </w:p>
+        </w:tc>
+        <w:tc>
+          <w:p>
+            <w:r>
+              <w:rPr>
+                <w:rFonts w:hint="eastAsia"/>
+                <w:lang w:val="en-US" w:eastAsia="zh-CN"/>
+              </w:rPr>
+              <w:t>识别解决外部发现的合规问题</w:t>
+            </w:r>
+          </w:p>
+        </w:tc>
+        <w:tc>
+          <w:p>
+            <w:r>
+              <w:rPr>
+                <w:rFonts w:hint="eastAsia"/>
+                <w:lang w:val="en-US" w:eastAsia="zh-CN"/>
+              </w:rPr>
+              <w:t>P2</w:t>
+            </w:r>
+          </w:p>
+        </w:tc>
+      </w:tr>
+      <w:tr>
+        <w:tblPrEx>
+          <w:tblBorders>
+            <w:top w:val="single" w:color="auto" w:sz="4" w:space="0"/>
+            <w:left w:val="single" w:color="auto" w:sz="4" w:space="0"/>
+            <w:bottom w:val="single" w:color="auto" w:sz="4" w:space="0"/>
+            <w:right w:val="single" w:color="auto" w:sz="4" w:space="0"/>
+            <w:insideH w:val="single" w:color="auto" w:sz="4" w:space="0"/>
+            <w:insideV w:val="single" w:color="auto" w:sz="4" w:space="0"/>
+          </w:tblBorders>
+          <w:tblCellMar>
+            <w:top w:w="0" w:type="dxa"/>
+            <w:left w:w="10" w:type="dxa"/>
+            <w:bottom w:w="0" w:type="dxa"/>
+            <w:right w:w="10" w:type="dxa"/>
+          </w:tblCellMar>
+        </w:tblPrEx>
+        <w:tc>
+          <w:p>
             <w:r>
               <w:t>CR-004 用户可以通过产品查询注册证、产品编码、工艺路线和检验规程</w:t>
             </w:r>
@@ -757,9 +1371,8 @@
         </w:tc>
         <w:tc>
           <w:p>
-            <w:pPr/>
-            <w:r>
-              <w:t xml:space="preserve">P0</w:t>
+            <w:r>
+              <w:t>P0</w:t>
             </w:r>
           </w:p>
         </w:tc>
@@ -871,17 +1484,15 @@
         </w:tc>
         <w:tc>
           <w:p>
-            <w:pPr/>
-            <w:r>
-              <w:t xml:space="preserve">每台设备至少具备名称、编码、状态、设备类型；设备维护变更应走审批；支持文件导入和导出。</w:t>
-            </w:r>
-          </w:p>
-        </w:tc>
-        <w:tc>
-          <w:p>
-            <w:pPr/>
-            <w:r>
-              <w:t xml:space="preserve">P1</w:t>
+            <w:r>
+              <w:t>每台设备至少具备名称、编码、状态、设备类型；设备维护变更应走审批；支持文件导入和导出。</w:t>
+            </w:r>
+          </w:p>
+        </w:tc>
+        <w:tc>
+          <w:p>
+            <w:r>
+              <w:t>P1</w:t>
             </w:r>
           </w:p>
         </w:tc>
@@ -933,17 +1544,15 @@
         </w:tc>
         <w:tc>
           <w:p>
-            <w:pPr/>
-            <w:r>
-              <w:t xml:space="preserve">工序可被工艺路线引用；可查看工序参与的工艺路线；支持上传对应 SOP。</w:t>
-            </w:r>
-          </w:p>
-        </w:tc>
-        <w:tc>
-          <w:p>
-            <w:pPr/>
-            <w:r>
-              <w:t xml:space="preserve">P1</w:t>
+            <w:r>
+              <w:t>工序可被工艺路线引用；可查看工序参与的工艺路线；支持上传对应 SOP。</w:t>
+            </w:r>
+          </w:p>
+        </w:tc>
+        <w:tc>
+          <w:p>
+            <w:r>
+              <w:t>P1</w:t>
             </w:r>
           </w:p>
         </w:tc>
@@ -958,7 +1567,7 @@
           <w:b/>
           <w:sz w:val="28"/>
         </w:rPr>
-        <w:t xml:space="preserve">02 模板解析与工艺配置</w:t>
+        <w:t>02 模板解析与工艺配置</w:t>
       </w:r>
     </w:p>
     <w:tbl>
@@ -983,12 +1592,12 @@
         </w:tblCellMar>
       </w:tblPr>
       <w:tblGrid>
-        <w:gridCol w:w="2144"/>
-        <w:gridCol w:w="3357"/>
-        <w:gridCol w:w="1949"/>
-        <w:gridCol w:w="1474"/>
-        <w:gridCol w:w="3504"/>
-        <w:gridCol w:w="935"/>
+        <w:gridCol w:w="2168"/>
+        <w:gridCol w:w="3425"/>
+        <w:gridCol w:w="1977"/>
+        <w:gridCol w:w="1485"/>
+        <w:gridCol w:w="3564"/>
+        <w:gridCol w:w="744"/>
       </w:tblGrid>
       <w:tr>
         <w:tblPrEx>
@@ -1097,17 +1706,15 @@
         </w:tc>
         <w:tc>
           <w:p>
-            <w:pPr/>
-            <w:r>
-              <w:t xml:space="preserve">只有审核发布的工艺路线可以使用；发布需审批；可查看版本；至少控制车间工序到中包到大包的先后关系。</w:t>
-            </w:r>
-          </w:p>
-        </w:tc>
-        <w:tc>
-          <w:p>
-            <w:pPr/>
-            <w:r>
-              <w:t xml:space="preserve">P0</w:t>
+            <w:r>
+              <w:t>只有审核发布的工艺路线可以使用；发布需审批；可查看版本；至少控制车间工序到中包到大包的先后关系。</w:t>
+            </w:r>
+          </w:p>
+        </w:tc>
+        <w:tc>
+          <w:p>
+            <w:r>
+              <w:t>P0</w:t>
             </w:r>
           </w:p>
         </w:tc>
@@ -1166,9 +1773,8 @@
         </w:tc>
         <w:tc>
           <w:p>
-            <w:pPr/>
-            <w:r>
-              <w:t xml:space="preserve">P0</w:t>
+            <w:r>
+              <w:t>P0</w:t>
             </w:r>
           </w:p>
         </w:tc>
@@ -1227,9 +1833,8 @@
         </w:tc>
         <w:tc>
           <w:p>
-            <w:pPr/>
-            <w:r>
-              <w:t xml:space="preserve">P0</w:t>
+            <w:r>
+              <w:t>P0</w:t>
             </w:r>
           </w:p>
         </w:tc>
@@ -1281,17 +1886,15 @@
         </w:tc>
         <w:tc>
           <w:p>
-            <w:pPr/>
-            <w:r>
-              <w:t xml:space="preserve">覆盖当前闭环必需字段；扩展完整类型覆盖和复杂可配置映射。</w:t>
-            </w:r>
-          </w:p>
-        </w:tc>
-        <w:tc>
-          <w:p>
-            <w:pPr/>
-            <w:r>
-              <w:t xml:space="preserve">P0</w:t>
+            <w:r>
+              <w:t>覆盖当前闭环必需字段；扩展完整类型覆盖和复杂可配置映射。</w:t>
+            </w:r>
+          </w:p>
+        </w:tc>
+        <w:tc>
+          <w:p>
+            <w:r>
+              <w:t>P0</w:t>
             </w:r>
           </w:p>
         </w:tc>
@@ -1403,17 +2006,15 @@
         </w:tc>
         <w:tc>
           <w:p>
-            <w:pPr/>
-            <w:r>
-              <w:t xml:space="preserve">只有审核发布的模板可使用；覆盖当前闭环必需字段；支持完整类型覆盖、下载、打印和作废。</w:t>
-            </w:r>
-          </w:p>
-        </w:tc>
-        <w:tc>
-          <w:p>
-            <w:pPr/>
-            <w:r>
-              <w:t xml:space="preserve">P0</w:t>
+            <w:r>
+              <w:t>只有审核发布的模板可使用；覆盖当前闭环必需字段；支持完整类型覆盖、下载、打印和作废。</w:t>
+            </w:r>
+          </w:p>
+        </w:tc>
+        <w:tc>
+          <w:p>
+            <w:r>
+              <w:t>P0</w:t>
             </w:r>
           </w:p>
         </w:tc>
@@ -1465,17 +2066,15 @@
         </w:tc>
         <w:tc>
           <w:p>
-            <w:pPr/>
-            <w:r>
-              <w:t xml:space="preserve">使用预置有效模板；支持审核发布模板、识别结果人工修正和当前产品阻断项处理。</w:t>
-            </w:r>
-          </w:p>
-        </w:tc>
-        <w:tc>
-          <w:p>
-            <w:pPr/>
-            <w:r>
-              <w:t xml:space="preserve">P1</w:t>
+            <w:r>
+              <w:t>使用预置有效模板；支持审核发布模板、识别结果人工修正和当前产品阻断项处理。</w:t>
+            </w:r>
+          </w:p>
+        </w:tc>
+        <w:tc>
+          <w:p>
+            <w:r>
+              <w:t>P1</w:t>
             </w:r>
           </w:p>
         </w:tc>
@@ -1490,7 +2089,7 @@
           <w:b/>
           <w:sz w:val="28"/>
         </w:rPr>
-        <w:t xml:space="preserve">03 生产与 PQC 现场执行</w:t>
+        <w:t>03 生产与 PQC 现场执行</w:t>
       </w:r>
     </w:p>
     <w:tbl>
@@ -1515,12 +2114,12 @@
         </w:tblCellMar>
       </w:tblPr>
       <w:tblGrid>
-        <w:gridCol w:w="2157"/>
-        <w:gridCol w:w="3482"/>
-        <w:gridCol w:w="2010"/>
-        <w:gridCol w:w="1521"/>
-        <w:gridCol w:w="3089"/>
-        <w:gridCol w:w="953"/>
+        <w:gridCol w:w="2185"/>
+        <w:gridCol w:w="3562"/>
+        <w:gridCol w:w="2044"/>
+        <w:gridCol w:w="1534"/>
+        <w:gridCol w:w="3143"/>
+        <w:gridCol w:w="744"/>
       </w:tblGrid>
       <w:tr>
         <w:tblPrEx>
@@ -1592,12 +2191,6 @@
             <w:insideH w:val="single" w:color="auto" w:sz="4" w:space="0"/>
             <w:insideV w:val="single" w:color="auto" w:sz="4" w:space="0"/>
           </w:tblBorders>
-          <w:tblCellMar>
-            <w:top w:w="0" w:type="dxa"/>
-            <w:left w:w="10" w:type="dxa"/>
-            <w:bottom w:w="0" w:type="dxa"/>
-            <w:right w:w="10" w:type="dxa"/>
-          </w:tblCellMar>
         </w:tblPrEx>
         <w:tc>
           <w:p>
@@ -1636,9 +2229,8 @@
         </w:tc>
         <w:tc>
           <w:p>
-            <w:pPr/>
-            <w:r>
-              <w:t xml:space="preserve">P0</w:t>
+            <w:r>
+              <w:t>P0</w:t>
             </w:r>
           </w:p>
         </w:tc>
@@ -1697,9 +2289,8 @@
         </w:tc>
         <w:tc>
           <w:p>
-            <w:pPr/>
-            <w:r>
-              <w:t xml:space="preserve">P0</w:t>
+            <w:r>
+              <w:t>P0</w:t>
             </w:r>
           </w:p>
         </w:tc>
@@ -1758,9 +2349,8 @@
         </w:tc>
         <w:tc>
           <w:p>
-            <w:pPr/>
-            <w:r>
-              <w:t xml:space="preserve">P0</w:t>
+            <w:r>
+              <w:t>P0</w:t>
             </w:r>
           </w:p>
         </w:tc>
@@ -1812,9 +2402,8 @@
         </w:tc>
         <w:tc>
           <w:p>
-            <w:pPr/>
-            <w:r>
-              <w:t xml:space="preserve">阈值默认为 10% 且可调整；禁止提交后需由组长分析原因并通过重提或后续流程处理。</w:t>
+            <w:r>
+              <w:t>阈值默认为 10% 且可调整；禁止提交后需由组长分析原因并通过重提或后续流程处理。</w:t>
             </w:r>
           </w:p>
         </w:tc>
@@ -1873,9 +2462,8 @@
         </w:tc>
         <w:tc>
           <w:p>
-            <w:pPr/>
-            <w:r>
-              <w:t xml:space="preserve">超限值应醒目标红；需要强制偏差说明或自动冻结批次，并保留处理记录。</w:t>
+            <w:r>
+              <w:t>超限值应醒目标红；需要强制偏差说明或自动冻结批次，并保留处理记录。</w:t>
             </w:r>
           </w:p>
         </w:tc>
@@ -1934,17 +2522,15 @@
         </w:tc>
         <w:tc>
           <w:p>
-            <w:pPr/>
-            <w:r>
-              <w:t xml:space="preserve">通过驳回后员工重新提交完成闭环；生产和检验完成后组长可点击完工并转 PQC 放行。</w:t>
-            </w:r>
-          </w:p>
-        </w:tc>
-        <w:tc>
-          <w:p>
-            <w:pPr/>
-            <w:r>
-              <w:t xml:space="preserve">P0</w:t>
+            <w:r>
+              <w:t>通过驳回后员工重新提交完成闭环；生产和检验完成后组长可点击完工并转 PQC 放行。</w:t>
+            </w:r>
+          </w:p>
+        </w:tc>
+        <w:tc>
+          <w:p>
+            <w:r>
+              <w:t>P0</w:t>
             </w:r>
           </w:p>
         </w:tc>
@@ -2019,7 +2605,7 @@
           <w:b/>
           <w:sz w:val="28"/>
         </w:rPr>
-        <w:t xml:space="preserve">04 批记录生成、放行与追溯</w:t>
+        <w:t>04 批记录生成、放行与追溯</w:t>
       </w:r>
     </w:p>
     <w:tbl>
@@ -2044,12 +2630,12 @@
         </w:tblCellMar>
       </w:tblPr>
       <w:tblGrid>
-        <w:gridCol w:w="2233"/>
-        <w:gridCol w:w="3335"/>
-        <w:gridCol w:w="1909"/>
-        <w:gridCol w:w="1737"/>
-        <w:gridCol w:w="2972"/>
-        <w:gridCol w:w="953"/>
+        <w:gridCol w:w="2275"/>
+        <w:gridCol w:w="3443"/>
+        <w:gridCol w:w="1953"/>
+        <w:gridCol w:w="1766"/>
+        <w:gridCol w:w="2958"/>
+        <w:gridCol w:w="744"/>
       </w:tblGrid>
       <w:tr>
         <w:tblPrEx>
@@ -2158,17 +2744,15 @@
         </w:tc>
         <w:tc>
           <w:p>
-            <w:pPr/>
-            <w:r>
-              <w:t xml:space="preserve">支持签字放行；支持发起不合格评审或驳回流程。</w:t>
-            </w:r>
-          </w:p>
-        </w:tc>
-        <w:tc>
-          <w:p>
-            <w:pPr/>
-            <w:r>
-              <w:t xml:space="preserve">P0</w:t>
+            <w:r>
+              <w:t>支持签字放行；支持发起不合格评审或驳回流程。</w:t>
+            </w:r>
+          </w:p>
+        </w:tc>
+        <w:tc>
+          <w:p>
+            <w:r>
+              <w:t>P0</w:t>
             </w:r>
           </w:p>
         </w:tc>
@@ -2220,9 +2804,8 @@
         </w:tc>
         <w:tc>
           <w:p>
-            <w:pPr/>
-            <w:r>
-              <w:t xml:space="preserve">必须生成当前产品闭环所需批记录表单、过程检验记录、损耗单和基础物料平衡单。</w:t>
+            <w:r>
+              <w:t>必须生成当前产品闭环所需批记录表单、过程检验记录、损耗单和基础物料平衡单。</w:t>
             </w:r>
           </w:p>
         </w:tc>
@@ -2281,17 +2864,15 @@
         </w:tc>
         <w:tc>
           <w:p>
-            <w:pPr/>
-            <w:r>
-              <w:t xml:space="preserve">支持上传灭菌、成品检等闭环必需附件；支持自动通知提醒。</w:t>
-            </w:r>
-          </w:p>
-        </w:tc>
-        <w:tc>
-          <w:p>
-            <w:pPr/>
-            <w:r>
-              <w:t xml:space="preserve">P0</w:t>
+            <w:r>
+              <w:t>支持上传灭菌、成品检等闭环必需附件；支持自动通知提醒。</w:t>
+            </w:r>
+          </w:p>
+        </w:tc>
+        <w:tc>
+          <w:p>
+            <w:r>
+              <w:t>P0</w:t>
             </w:r>
           </w:p>
         </w:tc>
@@ -2343,17 +2924,15 @@
         </w:tc>
         <w:tc>
           <w:p>
-            <w:pPr/>
-            <w:r>
-              <w:t xml:space="preserve">对空字段和基础物料平衡失败执行硬性拦截；扩展复杂物料平衡规则。</w:t>
-            </w:r>
-          </w:p>
-        </w:tc>
-        <w:tc>
-          <w:p>
-            <w:pPr/>
-            <w:r>
-              <w:t xml:space="preserve">P0</w:t>
+            <w:r>
+              <w:t>对空字段和基础物料平衡失败执行硬性拦截；扩展复杂物料平衡规则。</w:t>
+            </w:r>
+          </w:p>
+        </w:tc>
+        <w:tc>
+          <w:p>
+            <w:r>
+              <w:t>P0</w:t>
             </w:r>
           </w:p>
         </w:tc>
@@ -2465,17 +3044,15 @@
         </w:tc>
         <w:tc>
           <w:p>
-            <w:pPr/>
-            <w:r>
-              <w:t xml:space="preserve">支持正式 ERP 放行指令；发送结果应可追踪。</w:t>
-            </w:r>
-          </w:p>
-        </w:tc>
-        <w:tc>
-          <w:p>
-            <w:pPr/>
-            <w:r>
-              <w:t xml:space="preserve">P2</w:t>
+            <w:r>
+              <w:t>支持正式 ERP 放行指令；发送结果应可追踪。</w:t>
+            </w:r>
+          </w:p>
+        </w:tc>
+        <w:tc>
+          <w:p>
+            <w:r>
+              <w:t>P2</w:t>
             </w:r>
           </w:p>
         </w:tc>
@@ -2534,9 +3111,8 @@
         </w:tc>
         <w:tc>
           <w:p>
-            <w:pPr/>
-            <w:r>
-              <w:t xml:space="preserve">P0</w:t>
+            <w:r>
+              <w:t>P0</w:t>
             </w:r>
           </w:p>
         </w:tc>
@@ -2588,9 +3164,8 @@
         </w:tc>
         <w:tc>
           <w:p>
-            <w:pPr/>
-            <w:r>
-              <w:t xml:space="preserve">支持完整副本与纸质一致；视归档要求支持 PDF/A 长期归档格式。</w:t>
+            <w:r>
+              <w:t>支持完整副本与纸质一致；视归档要求支持 PDF/A 长期归档格式。</w:t>
             </w:r>
           </w:p>
         </w:tc>
@@ -2612,7 +3187,7 @@
           <w:b/>
           <w:sz w:val="28"/>
         </w:rPr>
-        <w:t xml:space="preserve">05 账号权限、审批与电子签名</w:t>
+        <w:t>05 账号权限、审批与电子签名</w:t>
       </w:r>
     </w:p>
     <w:tbl>
@@ -2637,12 +3212,12 @@
         </w:tblCellMar>
       </w:tblPr>
       <w:tblGrid>
-        <w:gridCol w:w="2154"/>
-        <w:gridCol w:w="3086"/>
-        <w:gridCol w:w="1736"/>
-        <w:gridCol w:w="1510"/>
-        <w:gridCol w:w="3386"/>
-        <w:gridCol w:w="949"/>
+        <w:gridCol w:w="2193"/>
+        <w:gridCol w:w="3185"/>
+        <w:gridCol w:w="1773"/>
+        <w:gridCol w:w="1529"/>
+        <w:gridCol w:w="3397"/>
+        <w:gridCol w:w="744"/>
       </w:tblGrid>
       <w:tr>
         <w:tblPrEx>
@@ -2751,17 +3326,15 @@
         </w:tc>
         <w:tc>
           <w:p>
-            <w:pPr/>
-            <w:r>
-              <w:t xml:space="preserve">每个用户应拥有个人专属域账号；账号锁定策略和自动登出已纳入基线；强化密码复杂度和离职转岗停用。</w:t>
-            </w:r>
-          </w:p>
-        </w:tc>
-        <w:tc>
-          <w:p>
-            <w:pPr/>
-            <w:r>
-              <w:t xml:space="preserve">P1</w:t>
+            <w:r>
+              <w:t>每个用户应拥有个人专属域账号；账号锁定策略和自动登出已纳入基线；强化密码复杂度和离职转岗停用。</w:t>
+            </w:r>
+          </w:p>
+        </w:tc>
+        <w:tc>
+          <w:p>
+            <w:r>
+              <w:t>P1</w:t>
             </w:r>
           </w:p>
         </w:tc>
@@ -2820,9 +3393,8 @@
         </w:tc>
         <w:tc>
           <w:p>
-            <w:pPr/>
-            <w:r>
-              <w:t xml:space="preserve">P1</w:t>
+            <w:r>
+              <w:t>P1</w:t>
             </w:r>
           </w:p>
         </w:tc>
@@ -2874,17 +3446,15 @@
         </w:tc>
         <w:tc>
           <w:p>
-            <w:pPr/>
-            <w:r>
-              <w:t xml:space="preserve">使用预置角色；支持角色维护、权限到期自动回收和文件导入导出。</w:t>
-            </w:r>
-          </w:p>
-        </w:tc>
-        <w:tc>
-          <w:p>
-            <w:pPr/>
-            <w:r>
-              <w:t xml:space="preserve">P1</w:t>
+            <w:r>
+              <w:t>使用预置角色；支持角色维护、权限到期自动回收和文件导入导出。</w:t>
+            </w:r>
+          </w:p>
+        </w:tc>
+        <w:tc>
+          <w:p>
+            <w:r>
+              <w:t>P1</w:t>
             </w:r>
           </w:p>
         </w:tc>
@@ -2943,9 +3513,8 @@
         </w:tc>
         <w:tc>
           <w:p>
-            <w:pPr/>
-            <w:r>
-              <w:t xml:space="preserve">P0</w:t>
+            <w:r>
+              <w:t>P0</w:t>
             </w:r>
           </w:p>
         </w:tc>
@@ -2997,17 +3566,15 @@
         </w:tc>
         <w:tc>
           <w:p>
-            <w:pPr/>
-            <w:r>
-              <w:t xml:space="preserve">导出记录应显示签署人全名、日期时间、时区和签署意图；补充签名加密绑定检查。</w:t>
-            </w:r>
-          </w:p>
-        </w:tc>
-        <w:tc>
-          <w:p>
-            <w:pPr/>
-            <w:r>
-              <w:t xml:space="preserve">P1</w:t>
+            <w:r>
+              <w:t>导出记录应显示签署人全名、日期时间、时区和签署意图；补充签名加密绑定检查。</w:t>
+            </w:r>
+          </w:p>
+        </w:tc>
+        <w:tc>
+          <w:p>
+            <w:r>
+              <w:t>P1</w:t>
             </w:r>
           </w:p>
         </w:tc>
@@ -3066,9 +3633,8 @@
         </w:tc>
         <w:tc>
           <w:p>
-            <w:pPr/>
-            <w:r>
-              <w:t xml:space="preserve">P1</w:t>
+            <w:r>
+              <w:t>P1</w:t>
             </w:r>
           </w:p>
         </w:tc>
@@ -3083,7 +3649,7 @@
           <w:b/>
           <w:sz w:val="28"/>
         </w:rPr>
-        <w:t xml:space="preserve">06 偏差、冻结与物料平衡</w:t>
+        <w:t>06 偏差、冻结与物料平衡</w:t>
       </w:r>
     </w:p>
     <w:tbl>
@@ -3402,9 +3968,8 @@
         </w:tc>
         <w:tc>
           <w:p>
-            <w:pPr/>
-            <w:r>
-              <w:t xml:space="preserve">系统应从生产领料工单、领料单和补料单获取物料批次和损耗信息，计算基础物料平衡；纳入复杂规则。</w:t>
+            <w:r>
+              <w:t>系统应从生产领料工单、领料单和补料单获取物料批次和损耗信息，计算基础物料平衡；纳入复杂规则。</w:t>
             </w:r>
           </w:p>
         </w:tc>
@@ -3426,7 +3991,7 @@
           <w:b/>
           <w:sz w:val="28"/>
         </w:rPr>
-        <w:t xml:space="preserve">07 合规运维、集成与 CSV</w:t>
+        <w:t>07 合规运维、集成与 CSV</w:t>
       </w:r>
     </w:p>
     <w:tbl>
@@ -3451,12 +4016,12 @@
         </w:tblCellMar>
       </w:tblPr>
       <w:tblGrid>
-        <w:gridCol w:w="2130"/>
-        <w:gridCol w:w="3306"/>
-        <w:gridCol w:w="1812"/>
-        <w:gridCol w:w="1435"/>
-        <w:gridCol w:w="3713"/>
-        <w:gridCol w:w="942"/>
+        <w:gridCol w:w="2163"/>
+        <w:gridCol w:w="3397"/>
+        <w:gridCol w:w="1846"/>
+        <w:gridCol w:w="1447"/>
+        <w:gridCol w:w="3741"/>
+        <w:gridCol w:w="744"/>
       </w:tblGrid>
       <w:tr>
         <w:tblPrEx>
@@ -3565,17 +4130,15 @@
         </w:tc>
         <w:tc>
           <w:p>
-            <w:pPr/>
-            <w:r>
-              <w:t xml:space="preserve">记录所有关键操作并校验完整性；日志导出动作本身也必须记录。</w:t>
-            </w:r>
-          </w:p>
-        </w:tc>
-        <w:tc>
-          <w:p>
-            <w:pPr/>
-            <w:r>
-              <w:t xml:space="preserve">P1</w:t>
+            <w:r>
+              <w:t>记录所有关键操作并校验完整性；日志导出动作本身也必须记录。</w:t>
+            </w:r>
+          </w:p>
+        </w:tc>
+        <w:tc>
+          <w:p>
+            <w:r>
+              <w:t>P1</w:t>
             </w:r>
           </w:p>
         </w:tc>
@@ -3627,9 +4190,8 @@
         </w:tc>
         <w:tc>
           <w:p>
-            <w:pPr/>
-            <w:r>
-              <w:t xml:space="preserve">支持每日增量备份、每周全量备份、备份失败报警、恢复演练报告、服务器时间同步和以服务器时间戳为准。</w:t>
+            <w:r>
+              <w:t>支持每日增量备份、每周全量备份、备份失败报警、恢复演练报告、服务器时间同步和以服务器时间戳为准。</w:t>
             </w:r>
           </w:p>
         </w:tc>
@@ -3688,9 +4250,8 @@
         </w:tc>
         <w:tc>
           <w:p>
-            <w:pPr/>
-            <w:r>
-              <w:t xml:space="preserve">需要灾备 SOP、灾备演练记录和系统恢复后的受控补录流程。</w:t>
+            <w:r>
+              <w:t>需要灾备 SOP、灾备演练记录和系统恢复后的受控补录流程。</w:t>
             </w:r>
           </w:p>
         </w:tc>
@@ -3809,17 +4370,15 @@
         </w:tc>
         <w:tc>
           <w:p>
-            <w:pPr/>
-            <w:r>
-              <w:t xml:space="preserve">已完成能力包括选择同步表单、设置每日同步时间、立即同步、增量同步和全量同步；支持正式放行指令。</w:t>
-            </w:r>
-          </w:p>
-        </w:tc>
-        <w:tc>
-          <w:p>
-            <w:pPr/>
-            <w:r>
-              <w:t xml:space="preserve">P2</w:t>
+            <w:r>
+              <w:t>已完成能力包括选择同步表单、设置每日同步时间、立即同步、增量同步和全量同步；支持正式放行指令。</w:t>
+            </w:r>
+          </w:p>
+        </w:tc>
+        <w:tc>
+          <w:p>
+            <w:r>
+              <w:t>P2</w:t>
             </w:r>
           </w:p>
         </w:tc>
@@ -3871,24 +4430,23 @@
         </w:tc>
         <w:tc>
           <w:p>
-            <w:pPr/>
-            <w:r>
-              <w:t xml:space="preserve">URS、验证计划、测试报告、验证总结报告、升级评估、安装记录和真实用户测试报告需纳入验证包；测试需覆盖边界并保留截图。</w:t>
-            </w:r>
-          </w:p>
-        </w:tc>
-        <w:tc>
-          <w:p>
-            <w:pPr/>
-            <w:r>
-              <w:t xml:space="preserve">P1</w:t>
+            <w:r>
+              <w:t>URS、验证计划、测试报告、验证总结报告、升级评估、安装记录和真实用户测试报告需纳入验证包；测试需覆盖边界并保留截图。</w:t>
+            </w:r>
+          </w:p>
+        </w:tc>
+        <w:tc>
+          <w:p>
+            <w:r>
+              <w:t>P1</w:t>
             </w:r>
           </w:p>
         </w:tc>
       </w:tr>
     </w:tbl>
+    <w:p/>
     <w:sectPr>
-      <w:footerReference w:type="default" r:id="rId5"/>
+      <w:footerReference r:id="rId5" w:type="default"/>
       <w:pgSz w:w="16838" w:h="11906" w:orient="landscape"/>
       <w:pgMar w:top="907" w:right="907" w:bottom="850" w:left="907" w:header="720" w:footer="454" w:gutter="0"/>
       <w:cols w:space="720" w:num="1"/>
@@ -4009,88 +4567,18 @@
 <file path=word/numbering.xml><?xml version="1.0" encoding="utf-8"?>
 <w:numbering xmlns:wpc="http://schemas.microsoft.com/office/word/2010/wordprocessingCanvas" xmlns:mc="http://schemas.openxmlformats.org/markup-compatibility/2006" xmlns:o="urn:schemas-microsoft-com:office:office" xmlns:r="http://schemas.openxmlformats.org/officeDocument/2006/relationships" xmlns:m="http://schemas.openxmlformats.org/officeDocument/2006/math" xmlns:v="urn:schemas-microsoft-com:vml" xmlns:wp14="http://schemas.microsoft.com/office/word/2010/wordprocessingDrawing" xmlns:wp="http://schemas.openxmlformats.org/drawingml/2006/wordprocessingDrawing" xmlns:w10="urn:schemas-microsoft-com:office:word" xmlns:w="http://schemas.openxmlformats.org/wordprocessingml/2006/main" xmlns:w14="http://schemas.microsoft.com/office/word/2010/wordml" xmlns:wpg="http://schemas.microsoft.com/office/word/2010/wordprocessingGroup" xmlns:wpi="http://schemas.microsoft.com/office/word/2010/wordprocessingInk" xmlns:wne="http://schemas.microsoft.com/office/word/2006/wordml" xmlns:wps="http://schemas.microsoft.com/office/word/2010/wordprocessingShape" xmlns:wpsCustomData="http://www.wps.cn/officeDocument/2013/wpsCustomData" mc:Ignorable="w14 wp14">
   <w:abstractNum w:abstractNumId="0">
-    <w:nsid w:val="CF092B84"/>
-    <w:multiLevelType w:val="multilevel"/>
-    <w:tmpl w:val="CF092B84"/>
+    <w:nsid w:val="8F3B0B08"/>
+    <w:multiLevelType w:val="singleLevel"/>
+    <w:tmpl w:val="8F3B0B08"/>
     <w:lvl w:ilvl="0" w:tentative="0">
       <w:start w:val="1"/>
       <w:numFmt w:val="decimal"/>
       <w:lvlText w:val="%1."/>
       <w:lvlJc w:val="left"/>
       <w:pPr>
-        <w:ind w:left="720" w:hanging="360"/>
-      </w:pPr>
-    </w:lvl>
-    <w:lvl w:ilvl="1" w:tentative="0">
-      <w:start w:val="1"/>
-      <w:numFmt w:val="lowerLetter"/>
-      <w:lvlText w:val="%2."/>
-      <w:lvlJc w:val="left"/>
-      <w:pPr>
-        <w:ind w:left="1440" w:hanging="360"/>
-      </w:pPr>
-    </w:lvl>
-    <w:lvl w:ilvl="2" w:tentative="0">
-      <w:start w:val="1"/>
-      <w:numFmt w:val="lowerRoman"/>
-      <w:lvlText w:val="%3."/>
-      <w:lvlJc w:val="left"/>
-      <w:pPr>
-        <w:ind w:left="2160" w:hanging="360"/>
-      </w:pPr>
-    </w:lvl>
-    <w:lvl w:ilvl="3" w:tentative="0">
-      <w:start w:val="1"/>
-      <w:numFmt w:val="decimal"/>
-      <w:lvlText w:val="%4."/>
-      <w:lvlJc w:val="left"/>
-      <w:pPr>
-        <w:ind w:left="2880" w:hanging="360"/>
-      </w:pPr>
-    </w:lvl>
-    <w:lvl w:ilvl="4" w:tentative="0">
-      <w:start w:val="1"/>
-      <w:numFmt w:val="lowerLetter"/>
-      <w:lvlText w:val="%5."/>
-      <w:lvlJc w:val="left"/>
-      <w:pPr>
-        <w:ind w:left="3600" w:hanging="360"/>
-      </w:pPr>
-    </w:lvl>
-    <w:lvl w:ilvl="5" w:tentative="0">
-      <w:start w:val="1"/>
-      <w:numFmt w:val="lowerRoman"/>
-      <w:lvlText w:val="%6."/>
-      <w:lvlJc w:val="left"/>
-      <w:pPr>
-        <w:ind w:left="4320" w:hanging="360"/>
-      </w:pPr>
-    </w:lvl>
-    <w:lvl w:ilvl="6" w:tentative="0">
-      <w:start w:val="1"/>
-      <w:numFmt w:val="decimal"/>
-      <w:lvlText w:val="%7."/>
-      <w:lvlJc w:val="left"/>
-      <w:pPr>
-        <w:ind w:left="5040" w:hanging="360"/>
-      </w:pPr>
-    </w:lvl>
-    <w:lvl w:ilvl="7" w:tentative="0">
-      <w:start w:val="1"/>
-      <w:numFmt w:val="lowerLetter"/>
-      <w:lvlText w:val="%8."/>
-      <w:lvlJc w:val="left"/>
-      <w:pPr>
-        <w:ind w:left="5760" w:hanging="360"/>
-      </w:pPr>
-    </w:lvl>
-    <w:lvl w:ilvl="8" w:tentative="0">
-      <w:start w:val="1"/>
-      <w:numFmt w:val="lowerRoman"/>
-      <w:lvlText w:val="%9."/>
-      <w:lvlJc w:val="left"/>
-      <w:pPr>
-        <w:ind w:left="6480" w:hanging="360"/>
+        <w:tabs>
+          <w:tab w:val="left" w:pos="312"/>
+        </w:tabs>
       </w:pPr>
     </w:lvl>
   </w:abstractNum>
@@ -4102,7 +4590,7 @@
 
 <file path=word/styles.xml><?xml version="1.0" encoding="utf-8"?>
 <w:styles xmlns:mc="http://schemas.openxmlformats.org/markup-compatibility/2006" xmlns:o="urn:schemas-microsoft-com:office:office" xmlns:r="http://schemas.openxmlformats.org/officeDocument/2006/relationships" xmlns:m="http://schemas.openxmlformats.org/officeDocument/2006/math" xmlns:v="urn:schemas-microsoft-com:vml" xmlns:w="http://schemas.openxmlformats.org/wordprocessingml/2006/main" xmlns:w14="http://schemas.microsoft.com/office/word/2010/wordml" xmlns:w10="urn:schemas-microsoft-com:office:word" xmlns:sl="http://schemas.openxmlformats.org/schemaLibrary/2006/main" xmlns:wpsCustomData="http://www.wps.cn/officeDocument/2013/wpsCustomData" mc:Ignorable="w14">
-  <w:docDefaults xmlns:mc="http://schemas.openxmlformats.org/markup-compatibility/2006" xmlns:o="urn:schemas-microsoft-com:office:office" xmlns:r="http://schemas.openxmlformats.org/officeDocument/2006/relationships" xmlns:m="http://schemas.openxmlformats.org/officeDocument/2006/math" xmlns:v="urn:schemas-microsoft-com:vml" xmlns:w="http://schemas.openxmlformats.org/wordprocessingml/2006/main" xmlns:w14="http://schemas.microsoft.com/office/word/2010/wordml" xmlns:w10="urn:schemas-microsoft-com:office:word" xmlns:sl="http://schemas.openxmlformats.org/schemaLibrary/2006/main" xmlns:wpsCustomData="http://www.wps.cn/officeDocument/2013/wpsCustomData">
+  <w:docDefaults>
     <w:rPrDefault>
       <w:rPr>
         <w:rFonts w:ascii="Times New Roman" w:hAnsi="Times New Roman" w:eastAsia="等线" w:cstheme="minorBidi"/>
@@ -4110,274 +4598,276 @@
     </w:rPrDefault>
     <w:pPrDefault/>
   </w:docDefaults>
-  <w:latentStyles xmlns:mc="http://schemas.openxmlformats.org/markup-compatibility/2006" xmlns:o="urn:schemas-microsoft-com:office:office" xmlns:r="http://schemas.openxmlformats.org/officeDocument/2006/relationships" xmlns:m="http://schemas.openxmlformats.org/officeDocument/2006/math" xmlns:v="urn:schemas-microsoft-com:vml" xmlns:w="http://schemas.openxmlformats.org/wordprocessingml/2006/main" xmlns:w14="http://schemas.microsoft.com/office/word/2010/wordml" xmlns:w10="urn:schemas-microsoft-com:office:word" xmlns:sl="http://schemas.openxmlformats.org/schemaLibrary/2006/main" xmlns:wpsCustomData="http://www.wps.cn/officeDocument/2013/wpsCustomData" w:defLockedState="0" w:defUIPriority="99" w:defSemiHidden="1" w:defUnhideWhenUsed="1" w:defQFormat="0" w:count="260">
-    <w:lsdException w:name="Normal" w:uiPriority="0" w:semiHidden="0" w:unhideWhenUsed="0" w:qFormat="1"/>
-    <w:lsdException w:name="heading 1" w:uiPriority="0" w:semiHidden="0" w:unhideWhenUsed="0" w:qFormat="1"/>
-    <w:lsdException w:name="heading 2" w:uiPriority="0" w:semiHidden="0" w:unhideWhenUsed="0" w:qFormat="1"/>
-    <w:lsdException w:name="heading 3" w:uiPriority="0" w:semiHidden="0" w:unhideWhenUsed="0" w:qFormat="1"/>
-    <w:lsdException w:name="heading 4" w:uiPriority="0" w:qFormat="1"/>
-    <w:lsdException w:name="heading 5" w:uiPriority="0" w:qFormat="1"/>
-    <w:lsdException w:name="heading 6" w:uiPriority="0" w:qFormat="1"/>
-    <w:lsdException w:name="heading 7" w:uiPriority="0" w:qFormat="1"/>
-    <w:lsdException w:name="heading 8" w:uiPriority="0" w:qFormat="1"/>
-    <w:lsdException w:name="heading 9" w:uiPriority="0" w:qFormat="1"/>
-    <w:lsdException w:name="index 1" w:uiPriority="0" w:semiHidden="0" w:unhideWhenUsed="0"/>
-    <w:lsdException w:name="index 2" w:uiPriority="0" w:semiHidden="0" w:unhideWhenUsed="0"/>
-    <w:lsdException w:name="index 3" w:uiPriority="0" w:semiHidden="0" w:unhideWhenUsed="0"/>
-    <w:lsdException w:name="index 4" w:uiPriority="0" w:semiHidden="0" w:unhideWhenUsed="0"/>
-    <w:lsdException w:name="index 5" w:uiPriority="0" w:semiHidden="0" w:unhideWhenUsed="0"/>
-    <w:lsdException w:name="index 6" w:uiPriority="0" w:semiHidden="0" w:unhideWhenUsed="0"/>
-    <w:lsdException w:name="index 7" w:uiPriority="0" w:semiHidden="0" w:unhideWhenUsed="0"/>
-    <w:lsdException w:name="index 8" w:uiPriority="0" w:semiHidden="0" w:unhideWhenUsed="0"/>
-    <w:lsdException w:name="index 9" w:uiPriority="0" w:semiHidden="0" w:unhideWhenUsed="0"/>
-    <w:lsdException w:name="toc 1" w:uiPriority="0" w:semiHidden="0" w:unhideWhenUsed="0"/>
-    <w:lsdException w:name="toc 2" w:uiPriority="0" w:semiHidden="0" w:unhideWhenUsed="0"/>
-    <w:lsdException w:name="toc 3" w:uiPriority="0" w:semiHidden="0" w:unhideWhenUsed="0"/>
-    <w:lsdException w:name="toc 4" w:uiPriority="0" w:semiHidden="0" w:unhideWhenUsed="0"/>
-    <w:lsdException w:name="toc 5" w:uiPriority="0" w:semiHidden="0" w:unhideWhenUsed="0"/>
-    <w:lsdException w:name="toc 6" w:uiPriority="0" w:semiHidden="0" w:unhideWhenUsed="0"/>
-    <w:lsdException w:name="toc 7" w:uiPriority="0" w:semiHidden="0" w:unhideWhenUsed="0"/>
-    <w:lsdException w:name="toc 8" w:uiPriority="0" w:semiHidden="0" w:unhideWhenUsed="0"/>
-    <w:lsdException w:name="toc 9" w:uiPriority="0" w:semiHidden="0" w:unhideWhenUsed="0"/>
-    <w:lsdException w:name="Normal Indent" w:uiPriority="0" w:semiHidden="0" w:unhideWhenUsed="0"/>
-    <w:lsdException w:name="footnote text" w:uiPriority="0" w:semiHidden="0" w:unhideWhenUsed="0"/>
-    <w:lsdException w:name="annotation text" w:uiPriority="0" w:semiHidden="0" w:unhideWhenUsed="0"/>
-    <w:lsdException w:name="header" w:uiPriority="0" w:semiHidden="0" w:unhideWhenUsed="0"/>
-    <w:lsdException w:name="footer" w:uiPriority="0" w:semiHidden="0" w:unhideWhenUsed="0"/>
-    <w:lsdException w:name="index heading" w:uiPriority="0" w:semiHidden="0" w:unhideWhenUsed="0"/>
-    <w:lsdException w:name="caption" w:uiPriority="0" w:qFormat="1"/>
-    <w:lsdException w:name="table of figures" w:uiPriority="0" w:semiHidden="0" w:unhideWhenUsed="0"/>
-    <w:lsdException w:name="envelope address" w:uiPriority="0" w:semiHidden="0" w:unhideWhenUsed="0"/>
-    <w:lsdException w:name="envelope return" w:uiPriority="0" w:semiHidden="0" w:unhideWhenUsed="0"/>
-    <w:lsdException w:name="footnote reference" w:uiPriority="0" w:semiHidden="0" w:unhideWhenUsed="0"/>
-    <w:lsdException w:name="annotation reference" w:uiPriority="0" w:semiHidden="0" w:unhideWhenUsed="0"/>
-    <w:lsdException w:name="line number" w:uiPriority="0" w:semiHidden="0" w:unhideWhenUsed="0"/>
-    <w:lsdException w:name="page number" w:uiPriority="0" w:semiHidden="0" w:unhideWhenUsed="0"/>
-    <w:lsdException w:name="endnote reference" w:uiPriority="0" w:semiHidden="0" w:unhideWhenUsed="0"/>
-    <w:lsdException w:name="endnote text" w:uiPriority="0" w:semiHidden="0" w:unhideWhenUsed="0"/>
-    <w:lsdException w:name="table of authorities" w:uiPriority="0" w:semiHidden="0" w:unhideWhenUsed="0"/>
-    <w:lsdException w:name="macro" w:uiPriority="0" w:semiHidden="0" w:unhideWhenUsed="0"/>
-    <w:lsdException w:name="toa heading" w:uiPriority="0" w:semiHidden="0" w:unhideWhenUsed="0"/>
-    <w:lsdException w:name="List" w:uiPriority="0" w:semiHidden="0" w:unhideWhenUsed="0"/>
-    <w:lsdException w:name="List Bullet" w:uiPriority="0" w:semiHidden="0" w:unhideWhenUsed="0"/>
-    <w:lsdException w:name="List Number" w:uiPriority="0" w:semiHidden="0" w:unhideWhenUsed="0"/>
-    <w:lsdException w:name="List 2" w:uiPriority="0" w:semiHidden="0" w:unhideWhenUsed="0"/>
-    <w:lsdException w:name="List 3" w:uiPriority="0" w:semiHidden="0" w:unhideWhenUsed="0"/>
-    <w:lsdException w:name="List 4" w:uiPriority="0" w:semiHidden="0" w:unhideWhenUsed="0"/>
-    <w:lsdException w:name="List 5" w:uiPriority="0" w:semiHidden="0" w:unhideWhenUsed="0"/>
-    <w:lsdException w:name="List Bullet 2" w:uiPriority="0" w:semiHidden="0" w:unhideWhenUsed="0"/>
-    <w:lsdException w:name="List Bullet 3" w:uiPriority="0" w:semiHidden="0" w:unhideWhenUsed="0"/>
-    <w:lsdException w:name="List Bullet 4" w:uiPriority="0" w:semiHidden="0" w:unhideWhenUsed="0"/>
-    <w:lsdException w:name="List Bullet 5" w:uiPriority="0" w:semiHidden="0" w:unhideWhenUsed="0"/>
-    <w:lsdException w:name="List Number 2" w:uiPriority="0" w:semiHidden="0" w:unhideWhenUsed="0"/>
-    <w:lsdException w:name="List Number 3" w:uiPriority="0" w:semiHidden="0" w:unhideWhenUsed="0"/>
-    <w:lsdException w:name="List Number 4" w:uiPriority="0" w:semiHidden="0" w:unhideWhenUsed="0"/>
-    <w:lsdException w:name="List Number 5" w:uiPriority="0" w:semiHidden="0" w:unhideWhenUsed="0"/>
-    <w:lsdException w:name="Title" w:uiPriority="0" w:semiHidden="0" w:unhideWhenUsed="0" w:qFormat="1"/>
-    <w:lsdException w:name="Closing" w:uiPriority="0" w:semiHidden="0" w:unhideWhenUsed="0"/>
-    <w:lsdException w:name="Signature" w:uiPriority="0" w:semiHidden="0" w:unhideWhenUsed="0"/>
-    <w:lsdException w:name="Default Paragraph Font" w:uiPriority="0" w:unhideWhenUsed="0"/>
-    <w:lsdException w:name="Body Text" w:uiPriority="0" w:semiHidden="0" w:unhideWhenUsed="0"/>
-    <w:lsdException w:name="Body Text Indent" w:uiPriority="0" w:semiHidden="0" w:unhideWhenUsed="0"/>
-    <w:lsdException w:name="List Continue" w:uiPriority="0" w:semiHidden="0" w:unhideWhenUsed="0"/>
-    <w:lsdException w:name="List Continue 2" w:uiPriority="0" w:semiHidden="0" w:unhideWhenUsed="0"/>
-    <w:lsdException w:name="List Continue 3" w:uiPriority="0" w:semiHidden="0" w:unhideWhenUsed="0"/>
-    <w:lsdException w:name="List Continue 4" w:uiPriority="0" w:semiHidden="0" w:unhideWhenUsed="0"/>
-    <w:lsdException w:name="List Continue 5" w:uiPriority="0" w:semiHidden="0" w:unhideWhenUsed="0"/>
-    <w:lsdException w:name="Message Header" w:uiPriority="0" w:semiHidden="0" w:unhideWhenUsed="0"/>
-    <w:lsdException w:name="Subtitle" w:uiPriority="0" w:semiHidden="0" w:unhideWhenUsed="0" w:qFormat="1"/>
-    <w:lsdException w:name="Salutation" w:uiPriority="0" w:semiHidden="0" w:unhideWhenUsed="0"/>
-    <w:lsdException w:name="Date" w:uiPriority="0" w:semiHidden="0" w:unhideWhenUsed="0"/>
-    <w:lsdException w:name="Body Text First Indent" w:uiPriority="0" w:semiHidden="0" w:unhideWhenUsed="0"/>
-    <w:lsdException w:name="Body Text First Indent 2" w:uiPriority="0" w:semiHidden="0" w:unhideWhenUsed="0"/>
-    <w:lsdException w:name="Note Heading" w:uiPriority="0" w:semiHidden="0" w:unhideWhenUsed="0"/>
-    <w:lsdException w:name="Body Text 2" w:uiPriority="0" w:semiHidden="0" w:unhideWhenUsed="0"/>
-    <w:lsdException w:name="Body Text 3" w:uiPriority="0" w:semiHidden="0" w:unhideWhenUsed="0"/>
-    <w:lsdException w:name="Body Text Indent 2" w:uiPriority="0" w:semiHidden="0" w:unhideWhenUsed="0"/>
-    <w:lsdException w:name="Body Text Indent 3" w:uiPriority="0" w:semiHidden="0" w:unhideWhenUsed="0"/>
-    <w:lsdException w:name="Block Text" w:uiPriority="0" w:semiHidden="0" w:unhideWhenUsed="0"/>
-    <w:lsdException w:name="Hyperlink" w:uiPriority="0" w:semiHidden="0" w:unhideWhenUsed="0"/>
-    <w:lsdException w:name="FollowedHyperlink" w:uiPriority="0" w:semiHidden="0" w:unhideWhenUsed="0"/>
-    <w:lsdException w:name="Strong" w:uiPriority="0" w:semiHidden="0" w:unhideWhenUsed="0" w:qFormat="1"/>
-    <w:lsdException w:name="Emphasis" w:uiPriority="0" w:semiHidden="0" w:unhideWhenUsed="0" w:qFormat="1"/>
-    <w:lsdException w:name="Document Map" w:uiPriority="0" w:semiHidden="0" w:unhideWhenUsed="0"/>
-    <w:lsdException w:name="Plain Text" w:uiPriority="0" w:semiHidden="0" w:unhideWhenUsed="0"/>
-    <w:lsdException w:name="E-mail Signature" w:uiPriority="0" w:semiHidden="0" w:unhideWhenUsed="0"/>
-    <w:lsdException w:name="Normal (Web)" w:uiPriority="0" w:semiHidden="0" w:unhideWhenUsed="0"/>
-    <w:lsdException w:name="HTML Acronym" w:uiPriority="0" w:semiHidden="0" w:unhideWhenUsed="0"/>
-    <w:lsdException w:name="HTML Address" w:uiPriority="0" w:semiHidden="0" w:unhideWhenUsed="0"/>
-    <w:lsdException w:name="HTML Cite" w:uiPriority="0" w:semiHidden="0" w:unhideWhenUsed="0"/>
-    <w:lsdException w:name="HTML Code" w:uiPriority="0" w:semiHidden="0" w:unhideWhenUsed="0"/>
-    <w:lsdException w:name="HTML Definition" w:uiPriority="0" w:semiHidden="0" w:unhideWhenUsed="0"/>
-    <w:lsdException w:name="HTML Keyboard" w:uiPriority="0" w:semiHidden="0" w:unhideWhenUsed="0"/>
-    <w:lsdException w:name="HTML Preformatted" w:uiPriority="0" w:semiHidden="0" w:unhideWhenUsed="0"/>
-    <w:lsdException w:name="HTML Sample" w:uiPriority="0" w:semiHidden="0" w:unhideWhenUsed="0"/>
-    <w:lsdException w:name="HTML Typewriter" w:uiPriority="0" w:semiHidden="0" w:unhideWhenUsed="0"/>
-    <w:lsdException w:name="HTML Variable" w:uiPriority="0" w:semiHidden="0" w:unhideWhenUsed="0"/>
-    <w:lsdException w:name="Normal Table" w:uiPriority="0" w:unhideWhenUsed="0"/>
-    <w:lsdException w:name="annotation subject" w:uiPriority="0" w:semiHidden="0" w:unhideWhenUsed="0"/>
-    <w:lsdException w:name="Table Simple 1" w:uiPriority="0" w:semiHidden="0" w:unhideWhenUsed="0"/>
-    <w:lsdException w:name="Table Simple 2" w:uiPriority="0" w:semiHidden="0" w:unhideWhenUsed="0"/>
-    <w:lsdException w:name="Table Simple 3" w:uiPriority="0" w:semiHidden="0" w:unhideWhenUsed="0"/>
-    <w:lsdException w:name="Table Classic 1" w:uiPriority="0" w:semiHidden="0" w:unhideWhenUsed="0"/>
-    <w:lsdException w:name="Table Classic 2" w:uiPriority="0" w:semiHidden="0" w:unhideWhenUsed="0"/>
-    <w:lsdException w:name="Table Classic 3" w:uiPriority="0" w:semiHidden="0" w:unhideWhenUsed="0"/>
-    <w:lsdException w:name="Table Classic 4" w:uiPriority="0" w:semiHidden="0" w:unhideWhenUsed="0"/>
-    <w:lsdException w:name="Table Colorful 1" w:uiPriority="0" w:semiHidden="0" w:unhideWhenUsed="0"/>
-    <w:lsdException w:name="Table Colorful 2" w:uiPriority="0" w:semiHidden="0" w:unhideWhenUsed="0"/>
-    <w:lsdException w:name="Table Colorful 3" w:uiPriority="0" w:semiHidden="0" w:unhideWhenUsed="0"/>
-    <w:lsdException w:name="Table Columns 1" w:uiPriority="0" w:semiHidden="0" w:unhideWhenUsed="0"/>
-    <w:lsdException w:name="Table Columns 2" w:uiPriority="0" w:semiHidden="0" w:unhideWhenUsed="0"/>
-    <w:lsdException w:name="Table Columns 3" w:uiPriority="0" w:semiHidden="0" w:unhideWhenUsed="0"/>
-    <w:lsdException w:name="Table Columns 4" w:uiPriority="0" w:semiHidden="0" w:unhideWhenUsed="0"/>
-    <w:lsdException w:name="Table Columns 5" w:uiPriority="0" w:semiHidden="0" w:unhideWhenUsed="0"/>
-    <w:lsdException w:name="Table Grid 1" w:uiPriority="0" w:semiHidden="0" w:unhideWhenUsed="0"/>
-    <w:lsdException w:name="Table Grid 2" w:uiPriority="0" w:semiHidden="0" w:unhideWhenUsed="0"/>
-    <w:lsdException w:name="Table Grid 3" w:uiPriority="0" w:semiHidden="0" w:unhideWhenUsed="0"/>
-    <w:lsdException w:name="Table Grid 4" w:uiPriority="0" w:semiHidden="0" w:unhideWhenUsed="0"/>
-    <w:lsdException w:name="Table Grid 5" w:uiPriority="0" w:semiHidden="0" w:unhideWhenUsed="0"/>
-    <w:lsdException w:name="Table Grid 6" w:uiPriority="0" w:semiHidden="0" w:unhideWhenUsed="0"/>
-    <w:lsdException w:name="Table Grid 7" w:uiPriority="0" w:semiHidden="0" w:unhideWhenUsed="0"/>
-    <w:lsdException w:name="Table Grid 8" w:uiPriority="0" w:semiHidden="0" w:unhideWhenUsed="0"/>
-    <w:lsdException w:name="Table List 1" w:uiPriority="0" w:semiHidden="0" w:unhideWhenUsed="0"/>
-    <w:lsdException w:name="Table List 2" w:uiPriority="0" w:semiHidden="0" w:unhideWhenUsed="0"/>
-    <w:lsdException w:name="Table List 3" w:uiPriority="0" w:semiHidden="0" w:unhideWhenUsed="0"/>
-    <w:lsdException w:name="Table List 4" w:uiPriority="0" w:semiHidden="0" w:unhideWhenUsed="0"/>
-    <w:lsdException w:name="Table List 5" w:uiPriority="0" w:semiHidden="0" w:unhideWhenUsed="0"/>
-    <w:lsdException w:name="Table List 6" w:uiPriority="0" w:semiHidden="0" w:unhideWhenUsed="0"/>
-    <w:lsdException w:name="Table List 7" w:uiPriority="0" w:semiHidden="0" w:unhideWhenUsed="0"/>
-    <w:lsdException w:name="Table List 8" w:uiPriority="0" w:semiHidden="0" w:unhideWhenUsed="0"/>
-    <w:lsdException w:name="Table 3D effects 1" w:uiPriority="0" w:semiHidden="0" w:unhideWhenUsed="0"/>
-    <w:lsdException w:name="Table 3D effects 2" w:uiPriority="0" w:semiHidden="0" w:unhideWhenUsed="0"/>
-    <w:lsdException w:name="Table 3D effects 3" w:uiPriority="0" w:semiHidden="0" w:unhideWhenUsed="0"/>
-    <w:lsdException w:name="Table Contemporary" w:uiPriority="0" w:semiHidden="0" w:unhideWhenUsed="0"/>
-    <w:lsdException w:name="Table Elegant" w:uiPriority="0" w:semiHidden="0" w:unhideWhenUsed="0"/>
-    <w:lsdException w:name="Table Professional" w:uiPriority="0" w:semiHidden="0" w:unhideWhenUsed="0"/>
-    <w:lsdException w:name="Table Subtle 1" w:uiPriority="0" w:semiHidden="0" w:unhideWhenUsed="0"/>
-    <w:lsdException w:name="Table Subtle 2" w:uiPriority="0" w:semiHidden="0" w:unhideWhenUsed="0"/>
-    <w:lsdException w:name="Table Web 1" w:uiPriority="0" w:semiHidden="0" w:unhideWhenUsed="0"/>
-    <w:lsdException w:name="Table Web 2" w:uiPriority="0" w:semiHidden="0" w:unhideWhenUsed="0"/>
-    <w:lsdException w:name="Table Web 3" w:uiPriority="0" w:semiHidden="0" w:unhideWhenUsed="0"/>
-    <w:lsdException w:name="Balloon Text" w:uiPriority="0" w:semiHidden="0" w:unhideWhenUsed="0"/>
-    <w:lsdException w:name="Table Grid" w:uiPriority="0" w:semiHidden="0" w:unhideWhenUsed="0"/>
-    <w:lsdException w:name="Table Theme" w:uiPriority="0" w:semiHidden="0" w:unhideWhenUsed="0"/>
-    <w:lsdException w:name="Light Shading" w:uiPriority="60" w:semiHidden="0" w:unhideWhenUsed="0"/>
-    <w:lsdException w:name="Light List" w:uiPriority="61" w:semiHidden="0" w:unhideWhenUsed="0"/>
-    <w:lsdException w:name="Light Grid" w:uiPriority="62" w:semiHidden="0" w:unhideWhenUsed="0"/>
-    <w:lsdException w:name="Medium Shading 1" w:uiPriority="63" w:semiHidden="0" w:unhideWhenUsed="0"/>
-    <w:lsdException w:name="Medium Shading 2" w:uiPriority="64" w:semiHidden="0" w:unhideWhenUsed="0"/>
-    <w:lsdException w:name="Medium List 1" w:uiPriority="65" w:semiHidden="0" w:unhideWhenUsed="0"/>
-    <w:lsdException w:name="Medium List 2" w:uiPriority="66" w:semiHidden="0" w:unhideWhenUsed="0"/>
-    <w:lsdException w:name="Medium Grid 1" w:uiPriority="67" w:semiHidden="0" w:unhideWhenUsed="0"/>
-    <w:lsdException w:name="Medium Grid 2" w:uiPriority="68" w:semiHidden="0" w:unhideWhenUsed="0"/>
-    <w:lsdException w:name="Medium Grid 3" w:uiPriority="69" w:semiHidden="0" w:unhideWhenUsed="0"/>
-    <w:lsdException w:name="Dark List" w:uiPriority="70" w:semiHidden="0" w:unhideWhenUsed="0"/>
-    <w:lsdException w:name="Colorful Shading" w:uiPriority="71" w:semiHidden="0" w:unhideWhenUsed="0"/>
-    <w:lsdException w:name="Colorful List" w:uiPriority="72" w:semiHidden="0" w:unhideWhenUsed="0"/>
-    <w:lsdException w:name="Colorful Grid" w:uiPriority="73" w:semiHidden="0" w:unhideWhenUsed="0"/>
-    <w:lsdException w:name="Light Shading Accent 1" w:uiPriority="60" w:semiHidden="0" w:unhideWhenUsed="0"/>
-    <w:lsdException w:name="Light List Accent 1" w:uiPriority="61" w:semiHidden="0" w:unhideWhenUsed="0"/>
-    <w:lsdException w:name="Light Grid Accent 1" w:uiPriority="62" w:semiHidden="0" w:unhideWhenUsed="0"/>
-    <w:lsdException w:name="Medium Shading 1 Accent 1" w:uiPriority="63" w:semiHidden="0" w:unhideWhenUsed="0"/>
-    <w:lsdException w:name="Medium Shading 2 Accent 1" w:uiPriority="64" w:semiHidden="0" w:unhideWhenUsed="0"/>
-    <w:lsdException w:name="Medium List 1 Accent 1" w:uiPriority="65" w:semiHidden="0" w:unhideWhenUsed="0"/>
-    <w:lsdException w:name="Medium List 2 Accent 1" w:uiPriority="66" w:semiHidden="0" w:unhideWhenUsed="0"/>
-    <w:lsdException w:name="Medium Grid 1 Accent 1" w:uiPriority="67" w:semiHidden="0" w:unhideWhenUsed="0"/>
-    <w:lsdException w:name="Medium Grid 2 Accent 1" w:uiPriority="68" w:semiHidden="0" w:unhideWhenUsed="0"/>
-    <w:lsdException w:name="Medium Grid 3 Accent 1" w:uiPriority="69" w:semiHidden="0" w:unhideWhenUsed="0"/>
-    <w:lsdException w:name="Dark List Accent 1" w:uiPriority="70" w:semiHidden="0" w:unhideWhenUsed="0"/>
-    <w:lsdException w:name="Colorful Shading Accent 1" w:uiPriority="71" w:semiHidden="0" w:unhideWhenUsed="0"/>
-    <w:lsdException w:name="Colorful List Accent 1" w:uiPriority="72" w:semiHidden="0" w:unhideWhenUsed="0"/>
-    <w:lsdException w:name="Colorful Grid Accent 1" w:uiPriority="73" w:semiHidden="0" w:unhideWhenUsed="0"/>
-    <w:lsdException w:name="Light Shading Accent 2" w:uiPriority="60" w:semiHidden="0" w:unhideWhenUsed="0"/>
-    <w:lsdException w:name="Light List Accent 2" w:uiPriority="61" w:semiHidden="0" w:unhideWhenUsed="0"/>
-    <w:lsdException w:name="Light Grid Accent 2" w:uiPriority="62" w:semiHidden="0" w:unhideWhenUsed="0"/>
-    <w:lsdException w:name="Medium Shading 1 Accent 2" w:uiPriority="63" w:semiHidden="0" w:unhideWhenUsed="0"/>
-    <w:lsdException w:name="Medium Shading 2 Accent 2" w:uiPriority="64" w:semiHidden="0" w:unhideWhenUsed="0"/>
-    <w:lsdException w:name="Medium List 1 Accent 2" w:uiPriority="65" w:semiHidden="0" w:unhideWhenUsed="0"/>
-    <w:lsdException w:name="Medium List 2 Accent 2" w:uiPriority="66" w:semiHidden="0" w:unhideWhenUsed="0"/>
-    <w:lsdException w:name="Medium Grid 1 Accent 2" w:uiPriority="67" w:semiHidden="0" w:unhideWhenUsed="0"/>
-    <w:lsdException w:name="Medium Grid 2 Accent 2" w:uiPriority="68" w:semiHidden="0" w:unhideWhenUsed="0"/>
-    <w:lsdException w:name="Medium Grid 3 Accent 2" w:uiPriority="69" w:semiHidden="0" w:unhideWhenUsed="0"/>
-    <w:lsdException w:name="Dark List Accent 2" w:uiPriority="70" w:semiHidden="0" w:unhideWhenUsed="0"/>
-    <w:lsdException w:name="Colorful Shading Accent 2" w:uiPriority="71" w:semiHidden="0" w:unhideWhenUsed="0"/>
-    <w:lsdException w:name="Colorful List Accent 2" w:uiPriority="72" w:semiHidden="0" w:unhideWhenUsed="0"/>
-    <w:lsdException w:name="Colorful Grid Accent 2" w:uiPriority="73" w:semiHidden="0" w:unhideWhenUsed="0"/>
-    <w:lsdException w:name="Light Shading Accent 3" w:uiPriority="60" w:semiHidden="0" w:unhideWhenUsed="0"/>
-    <w:lsdException w:name="Light List Accent 3" w:uiPriority="61" w:semiHidden="0" w:unhideWhenUsed="0"/>
-    <w:lsdException w:name="Light Grid Accent 3" w:uiPriority="62" w:semiHidden="0" w:unhideWhenUsed="0"/>
-    <w:lsdException w:name="Medium Shading 1 Accent 3" w:uiPriority="63" w:semiHidden="0" w:unhideWhenUsed="0"/>
-    <w:lsdException w:name="Medium Shading 2 Accent 3" w:uiPriority="64" w:semiHidden="0" w:unhideWhenUsed="0"/>
-    <w:lsdException w:name="Medium List 1 Accent 3" w:uiPriority="65" w:semiHidden="0" w:unhideWhenUsed="0"/>
-    <w:lsdException w:name="Medium List 2 Accent 3" w:uiPriority="66" w:semiHidden="0" w:unhideWhenUsed="0"/>
-    <w:lsdException w:name="Medium Grid 1 Accent 3" w:uiPriority="67" w:semiHidden="0" w:unhideWhenUsed="0"/>
-    <w:lsdException w:name="Medium Grid 2 Accent 3" w:uiPriority="68" w:semiHidden="0" w:unhideWhenUsed="0"/>
-    <w:lsdException w:name="Medium Grid 3 Accent 3" w:uiPriority="69" w:semiHidden="0" w:unhideWhenUsed="0"/>
-    <w:lsdException w:name="Dark List Accent 3" w:uiPriority="70" w:semiHidden="0" w:unhideWhenUsed="0"/>
-    <w:lsdException w:name="Colorful Shading Accent 3" w:uiPriority="71" w:semiHidden="0" w:unhideWhenUsed="0"/>
-    <w:lsdException w:name="Colorful List Accent 3" w:uiPriority="72" w:semiHidden="0" w:unhideWhenUsed="0"/>
-    <w:lsdException w:name="Colorful Grid Accent 3" w:uiPriority="73" w:semiHidden="0" w:unhideWhenUsed="0"/>
-    <w:lsdException w:name="Light Shading Accent 4" w:uiPriority="60" w:semiHidden="0" w:unhideWhenUsed="0"/>
-    <w:lsdException w:name="Light List Accent 4" w:uiPriority="61" w:semiHidden="0" w:unhideWhenUsed="0"/>
-    <w:lsdException w:name="Light Grid Accent 4" w:uiPriority="62" w:semiHidden="0" w:unhideWhenUsed="0"/>
-    <w:lsdException w:name="Medium Shading 1 Accent 4" w:uiPriority="63" w:semiHidden="0" w:unhideWhenUsed="0"/>
-    <w:lsdException w:name="Medium Shading 2 Accent 4" w:uiPriority="64" w:semiHidden="0" w:unhideWhenUsed="0"/>
-    <w:lsdException w:name="Medium List 1 Accent 4" w:uiPriority="65" w:semiHidden="0" w:unhideWhenUsed="0"/>
-    <w:lsdException w:name="Medium List 2 Accent 4" w:uiPriority="66" w:semiHidden="0" w:unhideWhenUsed="0"/>
-    <w:lsdException w:name="Medium Grid 1 Accent 4" w:uiPriority="67" w:semiHidden="0" w:unhideWhenUsed="0"/>
-    <w:lsdException w:name="Medium Grid 2 Accent 4" w:uiPriority="68" w:semiHidden="0" w:unhideWhenUsed="0"/>
-    <w:lsdException w:name="Medium Grid 3 Accent 4" w:uiPriority="69" w:semiHidden="0" w:unhideWhenUsed="0"/>
-    <w:lsdException w:name="Dark List Accent 4" w:uiPriority="70" w:semiHidden="0" w:unhideWhenUsed="0"/>
-    <w:lsdException w:name="Colorful Shading Accent 4" w:uiPriority="71" w:semiHidden="0" w:unhideWhenUsed="0"/>
-    <w:lsdException w:name="Colorful List Accent 4" w:uiPriority="72" w:semiHidden="0" w:unhideWhenUsed="0"/>
-    <w:lsdException w:name="Colorful Grid Accent 4" w:uiPriority="73" w:semiHidden="0" w:unhideWhenUsed="0"/>
-    <w:lsdException w:name="Light Shading Accent 5" w:uiPriority="60" w:semiHidden="0" w:unhideWhenUsed="0"/>
-    <w:lsdException w:name="Light List Accent 5" w:uiPriority="61" w:semiHidden="0" w:unhideWhenUsed="0"/>
-    <w:lsdException w:name="Light Grid Accent 5" w:uiPriority="62" w:semiHidden="0" w:unhideWhenUsed="0"/>
-    <w:lsdException w:name="Medium Shading 1 Accent 5" w:uiPriority="63" w:semiHidden="0" w:unhideWhenUsed="0"/>
-    <w:lsdException w:name="Medium Shading 2 Accent 5" w:uiPriority="64" w:semiHidden="0" w:unhideWhenUsed="0"/>
-    <w:lsdException w:name="Medium List 1 Accent 5" w:uiPriority="65" w:semiHidden="0" w:unhideWhenUsed="0"/>
-    <w:lsdException w:name="Medium List 2 Accent 5" w:uiPriority="66" w:semiHidden="0" w:unhideWhenUsed="0"/>
-    <w:lsdException w:name="Medium Grid 1 Accent 5" w:uiPriority="67" w:semiHidden="0" w:unhideWhenUsed="0"/>
-    <w:lsdException w:name="Medium Grid 2 Accent 5" w:uiPriority="68" w:semiHidden="0" w:unhideWhenUsed="0"/>
-    <w:lsdException w:name="Medium Grid 3 Accent 5" w:uiPriority="69" w:semiHidden="0" w:unhideWhenUsed="0"/>
-    <w:lsdException w:name="Dark List Accent 5" w:uiPriority="70" w:semiHidden="0" w:unhideWhenUsed="0"/>
-    <w:lsdException w:name="Colorful Shading Accent 5" w:uiPriority="71" w:semiHidden="0" w:unhideWhenUsed="0"/>
-    <w:lsdException w:name="Colorful List Accent 5" w:uiPriority="72" w:semiHidden="0" w:unhideWhenUsed="0"/>
-    <w:lsdException w:name="Colorful Grid Accent 5" w:uiPriority="73" w:semiHidden="0" w:unhideWhenUsed="0"/>
-    <w:lsdException w:name="Light Shading Accent 6" w:uiPriority="60" w:semiHidden="0" w:unhideWhenUsed="0"/>
-    <w:lsdException w:name="Light List Accent 6" w:uiPriority="61" w:semiHidden="0" w:unhideWhenUsed="0"/>
-    <w:lsdException w:name="Light Grid Accent 6" w:uiPriority="62" w:semiHidden="0" w:unhideWhenUsed="0"/>
-    <w:lsdException w:name="Medium Shading 1 Accent 6" w:uiPriority="63" w:semiHidden="0" w:unhideWhenUsed="0"/>
-    <w:lsdException w:name="Medium Shading 2 Accent 6" w:uiPriority="64" w:semiHidden="0" w:unhideWhenUsed="0"/>
-    <w:lsdException w:name="Medium List 1 Accent 6" w:uiPriority="65" w:semiHidden="0" w:unhideWhenUsed="0"/>
-    <w:lsdException w:name="Medium List 2 Accent 6" w:uiPriority="66" w:semiHidden="0" w:unhideWhenUsed="0"/>
-    <w:lsdException w:name="Medium Grid 1 Accent 6" w:uiPriority="67" w:semiHidden="0" w:unhideWhenUsed="0"/>
-    <w:lsdException w:name="Medium Grid 2 Accent 6" w:uiPriority="68" w:semiHidden="0" w:unhideWhenUsed="0"/>
-    <w:lsdException w:name="Medium Grid 3 Accent 6" w:uiPriority="69" w:semiHidden="0" w:unhideWhenUsed="0"/>
-    <w:lsdException w:name="Dark List Accent 6" w:uiPriority="70" w:semiHidden="0" w:unhideWhenUsed="0"/>
-    <w:lsdException w:name="Colorful Shading Accent 6" w:uiPriority="71" w:semiHidden="0" w:unhideWhenUsed="0"/>
-    <w:lsdException w:name="Colorful List Accent 6" w:uiPriority="72" w:semiHidden="0" w:unhideWhenUsed="0"/>
-    <w:lsdException w:name="Colorful Grid Accent 6" w:uiPriority="73" w:semiHidden="0" w:unhideWhenUsed="0"/>
+  <w:latentStyles w:count="260" w:defQFormat="0" w:defUnhideWhenUsed="1" w:defSemiHidden="1" w:defUIPriority="99" w:defLockedState="0">
+    <w:lsdException w:qFormat="1" w:unhideWhenUsed="0" w:uiPriority="0" w:semiHidden="0" w:name="Normal"/>
+    <w:lsdException w:qFormat="1" w:unhideWhenUsed="0" w:uiPriority="0" w:semiHidden="0" w:name="heading 1"/>
+    <w:lsdException w:qFormat="1" w:unhideWhenUsed="0" w:uiPriority="0" w:semiHidden="0" w:name="heading 2"/>
+    <w:lsdException w:qFormat="1" w:unhideWhenUsed="0" w:uiPriority="0" w:semiHidden="0" w:name="heading 3"/>
+    <w:lsdException w:qFormat="1" w:uiPriority="0" w:name="heading 4"/>
+    <w:lsdException w:qFormat="1" w:uiPriority="0" w:name="heading 5"/>
+    <w:lsdException w:qFormat="1" w:uiPriority="0" w:name="heading 6"/>
+    <w:lsdException w:qFormat="1" w:uiPriority="0" w:name="heading 7"/>
+    <w:lsdException w:qFormat="1" w:uiPriority="0" w:name="heading 8"/>
+    <w:lsdException w:qFormat="1" w:uiPriority="0" w:name="heading 9"/>
+    <w:lsdException w:unhideWhenUsed="0" w:uiPriority="0" w:semiHidden="0" w:name="index 1"/>
+    <w:lsdException w:unhideWhenUsed="0" w:uiPriority="0" w:semiHidden="0" w:name="index 2"/>
+    <w:lsdException w:unhideWhenUsed="0" w:uiPriority="0" w:semiHidden="0" w:name="index 3"/>
+    <w:lsdException w:unhideWhenUsed="0" w:uiPriority="0" w:semiHidden="0" w:name="index 4"/>
+    <w:lsdException w:unhideWhenUsed="0" w:uiPriority="0" w:semiHidden="0" w:name="index 5"/>
+    <w:lsdException w:unhideWhenUsed="0" w:uiPriority="0" w:semiHidden="0" w:name="index 6"/>
+    <w:lsdException w:unhideWhenUsed="0" w:uiPriority="0" w:semiHidden="0" w:name="index 7"/>
+    <w:lsdException w:unhideWhenUsed="0" w:uiPriority="0" w:semiHidden="0" w:name="index 8"/>
+    <w:lsdException w:unhideWhenUsed="0" w:uiPriority="0" w:semiHidden="0" w:name="index 9"/>
+    <w:lsdException w:unhideWhenUsed="0" w:uiPriority="0" w:semiHidden="0" w:name="toc 1"/>
+    <w:lsdException w:unhideWhenUsed="0" w:uiPriority="0" w:semiHidden="0" w:name="toc 2"/>
+    <w:lsdException w:unhideWhenUsed="0" w:uiPriority="0" w:semiHidden="0" w:name="toc 3"/>
+    <w:lsdException w:unhideWhenUsed="0" w:uiPriority="0" w:semiHidden="0" w:name="toc 4"/>
+    <w:lsdException w:unhideWhenUsed="0" w:uiPriority="0" w:semiHidden="0" w:name="toc 5"/>
+    <w:lsdException w:unhideWhenUsed="0" w:uiPriority="0" w:semiHidden="0" w:name="toc 6"/>
+    <w:lsdException w:unhideWhenUsed="0" w:uiPriority="0" w:semiHidden="0" w:name="toc 7"/>
+    <w:lsdException w:unhideWhenUsed="0" w:uiPriority="0" w:semiHidden="0" w:name="toc 8"/>
+    <w:lsdException w:unhideWhenUsed="0" w:uiPriority="0" w:semiHidden="0" w:name="toc 9"/>
+    <w:lsdException w:unhideWhenUsed="0" w:uiPriority="0" w:semiHidden="0" w:name="Normal Indent"/>
+    <w:lsdException w:unhideWhenUsed="0" w:uiPriority="0" w:semiHidden="0" w:name="footnote text"/>
+    <w:lsdException w:unhideWhenUsed="0" w:uiPriority="0" w:semiHidden="0" w:name="annotation text"/>
+    <w:lsdException w:unhideWhenUsed="0" w:uiPriority="0" w:semiHidden="0" w:name="header"/>
+    <w:lsdException w:unhideWhenUsed="0" w:uiPriority="0" w:semiHidden="0" w:name="footer"/>
+    <w:lsdException w:unhideWhenUsed="0" w:uiPriority="0" w:semiHidden="0" w:name="index heading"/>
+    <w:lsdException w:qFormat="1" w:uiPriority="0" w:name="caption"/>
+    <w:lsdException w:unhideWhenUsed="0" w:uiPriority="0" w:semiHidden="0" w:name="table of figures"/>
+    <w:lsdException w:unhideWhenUsed="0" w:uiPriority="0" w:semiHidden="0" w:name="envelope address"/>
+    <w:lsdException w:unhideWhenUsed="0" w:uiPriority="0" w:semiHidden="0" w:name="envelope return"/>
+    <w:lsdException w:unhideWhenUsed="0" w:uiPriority="0" w:semiHidden="0" w:name="footnote reference"/>
+    <w:lsdException w:unhideWhenUsed="0" w:uiPriority="0" w:semiHidden="0" w:name="annotation reference"/>
+    <w:lsdException w:unhideWhenUsed="0" w:uiPriority="0" w:semiHidden="0" w:name="line number"/>
+    <w:lsdException w:unhideWhenUsed="0" w:uiPriority="0" w:semiHidden="0" w:name="page number"/>
+    <w:lsdException w:unhideWhenUsed="0" w:uiPriority="0" w:semiHidden="0" w:name="endnote reference"/>
+    <w:lsdException w:unhideWhenUsed="0" w:uiPriority="0" w:semiHidden="0" w:name="endnote text"/>
+    <w:lsdException w:unhideWhenUsed="0" w:uiPriority="0" w:semiHidden="0" w:name="table of authorities"/>
+    <w:lsdException w:unhideWhenUsed="0" w:uiPriority="0" w:semiHidden="0" w:name="macro"/>
+    <w:lsdException w:unhideWhenUsed="0" w:uiPriority="0" w:semiHidden="0" w:name="toa heading"/>
+    <w:lsdException w:unhideWhenUsed="0" w:uiPriority="0" w:semiHidden="0" w:name="List"/>
+    <w:lsdException w:unhideWhenUsed="0" w:uiPriority="0" w:semiHidden="0" w:name="List Bullet"/>
+    <w:lsdException w:unhideWhenUsed="0" w:uiPriority="0" w:semiHidden="0" w:name="List Number"/>
+    <w:lsdException w:unhideWhenUsed="0" w:uiPriority="0" w:semiHidden="0" w:name="List 2"/>
+    <w:lsdException w:unhideWhenUsed="0" w:uiPriority="0" w:semiHidden="0" w:name="List 3"/>
+    <w:lsdException w:unhideWhenUsed="0" w:uiPriority="0" w:semiHidden="0" w:name="List 4"/>
+    <w:lsdException w:unhideWhenUsed="0" w:uiPriority="0" w:semiHidden="0" w:name="List 5"/>
+    <w:lsdException w:unhideWhenUsed="0" w:uiPriority="0" w:semiHidden="0" w:name="List Bullet 2"/>
+    <w:lsdException w:unhideWhenUsed="0" w:uiPriority="0" w:semiHidden="0" w:name="List Bullet 3"/>
+    <w:lsdException w:unhideWhenUsed="0" w:uiPriority="0" w:semiHidden="0" w:name="List Bullet 4"/>
+    <w:lsdException w:unhideWhenUsed="0" w:uiPriority="0" w:semiHidden="0" w:name="List Bullet 5"/>
+    <w:lsdException w:unhideWhenUsed="0" w:uiPriority="0" w:semiHidden="0" w:name="List Number 2"/>
+    <w:lsdException w:unhideWhenUsed="0" w:uiPriority="0" w:semiHidden="0" w:name="List Number 3"/>
+    <w:lsdException w:unhideWhenUsed="0" w:uiPriority="0" w:semiHidden="0" w:name="List Number 4"/>
+    <w:lsdException w:unhideWhenUsed="0" w:uiPriority="0" w:semiHidden="0" w:name="List Number 5"/>
+    <w:lsdException w:qFormat="1" w:unhideWhenUsed="0" w:uiPriority="0" w:semiHidden="0" w:name="Title"/>
+    <w:lsdException w:unhideWhenUsed="0" w:uiPriority="0" w:semiHidden="0" w:name="Closing"/>
+    <w:lsdException w:unhideWhenUsed="0" w:uiPriority="0" w:semiHidden="0" w:name="Signature"/>
+    <w:lsdException w:unhideWhenUsed="0" w:uiPriority="0" w:name="Default Paragraph Font"/>
+    <w:lsdException w:unhideWhenUsed="0" w:uiPriority="0" w:semiHidden="0" w:name="Body Text"/>
+    <w:lsdException w:unhideWhenUsed="0" w:uiPriority="0" w:semiHidden="0" w:name="Body Text Indent"/>
+    <w:lsdException w:unhideWhenUsed="0" w:uiPriority="0" w:semiHidden="0" w:name="List Continue"/>
+    <w:lsdException w:unhideWhenUsed="0" w:uiPriority="0" w:semiHidden="0" w:name="List Continue 2"/>
+    <w:lsdException w:unhideWhenUsed="0" w:uiPriority="0" w:semiHidden="0" w:name="List Continue 3"/>
+    <w:lsdException w:unhideWhenUsed="0" w:uiPriority="0" w:semiHidden="0" w:name="List Continue 4"/>
+    <w:lsdException w:unhideWhenUsed="0" w:uiPriority="0" w:semiHidden="0" w:name="List Continue 5"/>
+    <w:lsdException w:unhideWhenUsed="0" w:uiPriority="0" w:semiHidden="0" w:name="Message Header"/>
+    <w:lsdException w:qFormat="1" w:unhideWhenUsed="0" w:uiPriority="0" w:semiHidden="0" w:name="Subtitle"/>
+    <w:lsdException w:unhideWhenUsed="0" w:uiPriority="0" w:semiHidden="0" w:name="Salutation"/>
+    <w:lsdException w:unhideWhenUsed="0" w:uiPriority="0" w:semiHidden="0" w:name="Date"/>
+    <w:lsdException w:unhideWhenUsed="0" w:uiPriority="0" w:semiHidden="0" w:name="Body Text First Indent"/>
+    <w:lsdException w:unhideWhenUsed="0" w:uiPriority="0" w:semiHidden="0" w:name="Body Text First Indent 2"/>
+    <w:lsdException w:unhideWhenUsed="0" w:uiPriority="0" w:semiHidden="0" w:name="Note Heading"/>
+    <w:lsdException w:unhideWhenUsed="0" w:uiPriority="0" w:semiHidden="0" w:name="Body Text 2"/>
+    <w:lsdException w:unhideWhenUsed="0" w:uiPriority="0" w:semiHidden="0" w:name="Body Text 3"/>
+    <w:lsdException w:unhideWhenUsed="0" w:uiPriority="0" w:semiHidden="0" w:name="Body Text Indent 2"/>
+    <w:lsdException w:unhideWhenUsed="0" w:uiPriority="0" w:semiHidden="0" w:name="Body Text Indent 3"/>
+    <w:lsdException w:unhideWhenUsed="0" w:uiPriority="0" w:semiHidden="0" w:name="Block Text"/>
+    <w:lsdException w:unhideWhenUsed="0" w:uiPriority="0" w:semiHidden="0" w:name="Hyperlink"/>
+    <w:lsdException w:unhideWhenUsed="0" w:uiPriority="0" w:semiHidden="0" w:name="FollowedHyperlink"/>
+    <w:lsdException w:qFormat="1" w:unhideWhenUsed="0" w:uiPriority="0" w:semiHidden="0" w:name="Strong"/>
+    <w:lsdException w:qFormat="1" w:unhideWhenUsed="0" w:uiPriority="0" w:semiHidden="0" w:name="Emphasis"/>
+    <w:lsdException w:unhideWhenUsed="0" w:uiPriority="0" w:semiHidden="0" w:name="Document Map"/>
+    <w:lsdException w:unhideWhenUsed="0" w:uiPriority="0" w:semiHidden="0" w:name="Plain Text"/>
+    <w:lsdException w:unhideWhenUsed="0" w:uiPriority="0" w:semiHidden="0" w:name="E-mail Signature"/>
+    <w:lsdException w:unhideWhenUsed="0" w:uiPriority="0" w:semiHidden="0" w:name="Normal (Web)"/>
+    <w:lsdException w:unhideWhenUsed="0" w:uiPriority="0" w:semiHidden="0" w:name="HTML Acronym"/>
+    <w:lsdException w:unhideWhenUsed="0" w:uiPriority="0" w:semiHidden="0" w:name="HTML Address"/>
+    <w:lsdException w:unhideWhenUsed="0" w:uiPriority="0" w:semiHidden="0" w:name="HTML Cite"/>
+    <w:lsdException w:unhideWhenUsed="0" w:uiPriority="0" w:semiHidden="0" w:name="HTML Code"/>
+    <w:lsdException w:unhideWhenUsed="0" w:uiPriority="0" w:semiHidden="0" w:name="HTML Definition"/>
+    <w:lsdException w:unhideWhenUsed="0" w:uiPriority="0" w:semiHidden="0" w:name="HTML Keyboard"/>
+    <w:lsdException w:unhideWhenUsed="0" w:uiPriority="0" w:semiHidden="0" w:name="HTML Preformatted"/>
+    <w:lsdException w:unhideWhenUsed="0" w:uiPriority="0" w:semiHidden="0" w:name="HTML Sample"/>
+    <w:lsdException w:unhideWhenUsed="0" w:uiPriority="0" w:semiHidden="0" w:name="HTML Typewriter"/>
+    <w:lsdException w:unhideWhenUsed="0" w:uiPriority="0" w:semiHidden="0" w:name="HTML Variable"/>
+    <w:lsdException w:qFormat="1" w:unhideWhenUsed="0" w:uiPriority="0" w:name="Normal Table"/>
+    <w:lsdException w:unhideWhenUsed="0" w:uiPriority="0" w:semiHidden="0" w:name="annotation subject"/>
+    <w:lsdException w:unhideWhenUsed="0" w:uiPriority="0" w:semiHidden="0" w:name="Table Simple 1"/>
+    <w:lsdException w:unhideWhenUsed="0" w:uiPriority="0" w:semiHidden="0" w:name="Table Simple 2"/>
+    <w:lsdException w:unhideWhenUsed="0" w:uiPriority="0" w:semiHidden="0" w:name="Table Simple 3"/>
+    <w:lsdException w:unhideWhenUsed="0" w:uiPriority="0" w:semiHidden="0" w:name="Table Classic 1"/>
+    <w:lsdException w:unhideWhenUsed="0" w:uiPriority="0" w:semiHidden="0" w:name="Table Classic 2"/>
+    <w:lsdException w:unhideWhenUsed="0" w:uiPriority="0" w:semiHidden="0" w:name="Table Classic 3"/>
+    <w:lsdException w:unhideWhenUsed="0" w:uiPriority="0" w:semiHidden="0" w:name="Table Classic 4"/>
+    <w:lsdException w:unhideWhenUsed="0" w:uiPriority="0" w:semiHidden="0" w:name="Table Colorful 1"/>
+    <w:lsdException w:unhideWhenUsed="0" w:uiPriority="0" w:semiHidden="0" w:name="Table Colorful 2"/>
+    <w:lsdException w:unhideWhenUsed="0" w:uiPriority="0" w:semiHidden="0" w:name="Table Colorful 3"/>
+    <w:lsdException w:unhideWhenUsed="0" w:uiPriority="0" w:semiHidden="0" w:name="Table Columns 1"/>
+    <w:lsdException w:unhideWhenUsed="0" w:uiPriority="0" w:semiHidden="0" w:name="Table Columns 2"/>
+    <w:lsdException w:unhideWhenUsed="0" w:uiPriority="0" w:semiHidden="0" w:name="Table Columns 3"/>
+    <w:lsdException w:unhideWhenUsed="0" w:uiPriority="0" w:semiHidden="0" w:name="Table Columns 4"/>
+    <w:lsdException w:unhideWhenUsed="0" w:uiPriority="0" w:semiHidden="0" w:name="Table Columns 5"/>
+    <w:lsdException w:unhideWhenUsed="0" w:uiPriority="0" w:semiHidden="0" w:name="Table Grid 1"/>
+    <w:lsdException w:unhideWhenUsed="0" w:uiPriority="0" w:semiHidden="0" w:name="Table Grid 2"/>
+    <w:lsdException w:unhideWhenUsed="0" w:uiPriority="0" w:semiHidden="0" w:name="Table Grid 3"/>
+    <w:lsdException w:unhideWhenUsed="0" w:uiPriority="0" w:semiHidden="0" w:name="Table Grid 4"/>
+    <w:lsdException w:unhideWhenUsed="0" w:uiPriority="0" w:semiHidden="0" w:name="Table Grid 5"/>
+    <w:lsdException w:unhideWhenUsed="0" w:uiPriority="0" w:semiHidden="0" w:name="Table Grid 6"/>
+    <w:lsdException w:unhideWhenUsed="0" w:uiPriority="0" w:semiHidden="0" w:name="Table Grid 7"/>
+    <w:lsdException w:unhideWhenUsed="0" w:uiPriority="0" w:semiHidden="0" w:name="Table Grid 8"/>
+    <w:lsdException w:unhideWhenUsed="0" w:uiPriority="0" w:semiHidden="0" w:name="Table List 1"/>
+    <w:lsdException w:unhideWhenUsed="0" w:uiPriority="0" w:semiHidden="0" w:name="Table List 2"/>
+    <w:lsdException w:unhideWhenUsed="0" w:uiPriority="0" w:semiHidden="0" w:name="Table List 3"/>
+    <w:lsdException w:unhideWhenUsed="0" w:uiPriority="0" w:semiHidden="0" w:name="Table List 4"/>
+    <w:lsdException w:unhideWhenUsed="0" w:uiPriority="0" w:semiHidden="0" w:name="Table List 5"/>
+    <w:lsdException w:unhideWhenUsed="0" w:uiPriority="0" w:semiHidden="0" w:name="Table List 6"/>
+    <w:lsdException w:unhideWhenUsed="0" w:uiPriority="0" w:semiHidden="0" w:name="Table List 7"/>
+    <w:lsdException w:unhideWhenUsed="0" w:uiPriority="0" w:semiHidden="0" w:name="Table List 8"/>
+    <w:lsdException w:unhideWhenUsed="0" w:uiPriority="0" w:semiHidden="0" w:name="Table 3D effects 1"/>
+    <w:lsdException w:unhideWhenUsed="0" w:uiPriority="0" w:semiHidden="0" w:name="Table 3D effects 2"/>
+    <w:lsdException w:unhideWhenUsed="0" w:uiPriority="0" w:semiHidden="0" w:name="Table 3D effects 3"/>
+    <w:lsdException w:unhideWhenUsed="0" w:uiPriority="0" w:semiHidden="0" w:name="Table Contemporary"/>
+    <w:lsdException w:unhideWhenUsed="0" w:uiPriority="0" w:semiHidden="0" w:name="Table Elegant"/>
+    <w:lsdException w:unhideWhenUsed="0" w:uiPriority="0" w:semiHidden="0" w:name="Table Professional"/>
+    <w:lsdException w:unhideWhenUsed="0" w:uiPriority="0" w:semiHidden="0" w:name="Table Subtle 1"/>
+    <w:lsdException w:unhideWhenUsed="0" w:uiPriority="0" w:semiHidden="0" w:name="Table Subtle 2"/>
+    <w:lsdException w:unhideWhenUsed="0" w:uiPriority="0" w:semiHidden="0" w:name="Table Web 1"/>
+    <w:lsdException w:unhideWhenUsed="0" w:uiPriority="0" w:semiHidden="0" w:name="Table Web 2"/>
+    <w:lsdException w:unhideWhenUsed="0" w:uiPriority="0" w:semiHidden="0" w:name="Table Web 3"/>
+    <w:lsdException w:unhideWhenUsed="0" w:uiPriority="0" w:semiHidden="0" w:name="Balloon Text"/>
+    <w:lsdException w:unhideWhenUsed="0" w:uiPriority="0" w:semiHidden="0" w:name="Table Grid"/>
+    <w:lsdException w:unhideWhenUsed="0" w:uiPriority="0" w:semiHidden="0" w:name="Table Theme"/>
+    <w:lsdException w:unhideWhenUsed="0" w:uiPriority="60" w:semiHidden="0" w:name="Light Shading"/>
+    <w:lsdException w:unhideWhenUsed="0" w:uiPriority="61" w:semiHidden="0" w:name="Light List"/>
+    <w:lsdException w:unhideWhenUsed="0" w:uiPriority="62" w:semiHidden="0" w:name="Light Grid"/>
+    <w:lsdException w:unhideWhenUsed="0" w:uiPriority="63" w:semiHidden="0" w:name="Medium Shading 1"/>
+    <w:lsdException w:unhideWhenUsed="0" w:uiPriority="64" w:semiHidden="0" w:name="Medium Shading 2"/>
+    <w:lsdException w:unhideWhenUsed="0" w:uiPriority="65" w:semiHidden="0" w:name="Medium List 1"/>
+    <w:lsdException w:unhideWhenUsed="0" w:uiPriority="66" w:semiHidden="0" w:name="Medium List 2"/>
+    <w:lsdException w:unhideWhenUsed="0" w:uiPriority="67" w:semiHidden="0" w:name="Medium Grid 1"/>
+    <w:lsdException w:unhideWhenUsed="0" w:uiPriority="68" w:semiHidden="0" w:name="Medium Grid 2"/>
+    <w:lsdException w:unhideWhenUsed="0" w:uiPriority="69" w:semiHidden="0" w:name="Medium Grid 3"/>
+    <w:lsdException w:unhideWhenUsed="0" w:uiPriority="70" w:semiHidden="0" w:name="Dark List"/>
+    <w:lsdException w:unhideWhenUsed="0" w:uiPriority="71" w:semiHidden="0" w:name="Colorful Shading"/>
+    <w:lsdException w:unhideWhenUsed="0" w:uiPriority="72" w:semiHidden="0" w:name="Colorful List"/>
+    <w:lsdException w:unhideWhenUsed="0" w:uiPriority="73" w:semiHidden="0" w:name="Colorful Grid"/>
+    <w:lsdException w:unhideWhenUsed="0" w:uiPriority="60" w:semiHidden="0" w:name="Light Shading Accent 1"/>
+    <w:lsdException w:unhideWhenUsed="0" w:uiPriority="61" w:semiHidden="0" w:name="Light List Accent 1"/>
+    <w:lsdException w:unhideWhenUsed="0" w:uiPriority="62" w:semiHidden="0" w:name="Light Grid Accent 1"/>
+    <w:lsdException w:unhideWhenUsed="0" w:uiPriority="63" w:semiHidden="0" w:name="Medium Shading 1 Accent 1"/>
+    <w:lsdException w:unhideWhenUsed="0" w:uiPriority="64" w:semiHidden="0" w:name="Medium Shading 2 Accent 1"/>
+    <w:lsdException w:unhideWhenUsed="0" w:uiPriority="65" w:semiHidden="0" w:name="Medium List 1 Accent 1"/>
+    <w:lsdException w:unhideWhenUsed="0" w:uiPriority="66" w:semiHidden="0" w:name="Medium List 2 Accent 1"/>
+    <w:lsdException w:unhideWhenUsed="0" w:uiPriority="67" w:semiHidden="0" w:name="Medium Grid 1 Accent 1"/>
+    <w:lsdException w:unhideWhenUsed="0" w:uiPriority="68" w:semiHidden="0" w:name="Medium Grid 2 Accent 1"/>
+    <w:lsdException w:unhideWhenUsed="0" w:uiPriority="69" w:semiHidden="0" w:name="Medium Grid 3 Accent 1"/>
+    <w:lsdException w:unhideWhenUsed="0" w:uiPriority="70" w:semiHidden="0" w:name="Dark List Accent 1"/>
+    <w:lsdException w:unhideWhenUsed="0" w:uiPriority="71" w:semiHidden="0" w:name="Colorful Shading Accent 1"/>
+    <w:lsdException w:unhideWhenUsed="0" w:uiPriority="72" w:semiHidden="0" w:name="Colorful List Accent 1"/>
+    <w:lsdException w:unhideWhenUsed="0" w:uiPriority="73" w:semiHidden="0" w:name="Colorful Grid Accent 1"/>
+    <w:lsdException w:unhideWhenUsed="0" w:uiPriority="60" w:semiHidden="0" w:name="Light Shading Accent 2"/>
+    <w:lsdException w:unhideWhenUsed="0" w:uiPriority="61" w:semiHidden="0" w:name="Light List Accent 2"/>
+    <w:lsdException w:unhideWhenUsed="0" w:uiPriority="62" w:semiHidden="0" w:name="Light Grid Accent 2"/>
+    <w:lsdException w:unhideWhenUsed="0" w:uiPriority="63" w:semiHidden="0" w:name="Medium Shading 1 Accent 2"/>
+    <w:lsdException w:unhideWhenUsed="0" w:uiPriority="64" w:semiHidden="0" w:name="Medium Shading 2 Accent 2"/>
+    <w:lsdException w:unhideWhenUsed="0" w:uiPriority="65" w:semiHidden="0" w:name="Medium List 1 Accent 2"/>
+    <w:lsdException w:unhideWhenUsed="0" w:uiPriority="66" w:semiHidden="0" w:name="Medium List 2 Accent 2"/>
+    <w:lsdException w:unhideWhenUsed="0" w:uiPriority="67" w:semiHidden="0" w:name="Medium Grid 1 Accent 2"/>
+    <w:lsdException w:unhideWhenUsed="0" w:uiPriority="68" w:semiHidden="0" w:name="Medium Grid 2 Accent 2"/>
+    <w:lsdException w:unhideWhenUsed="0" w:uiPriority="69" w:semiHidden="0" w:name="Medium Grid 3 Accent 2"/>
+    <w:lsdException w:unhideWhenUsed="0" w:uiPriority="70" w:semiHidden="0" w:name="Dark List Accent 2"/>
+    <w:lsdException w:unhideWhenUsed="0" w:uiPriority="71" w:semiHidden="0" w:name="Colorful Shading Accent 2"/>
+    <w:lsdException w:unhideWhenUsed="0" w:uiPriority="72" w:semiHidden="0" w:name="Colorful List Accent 2"/>
+    <w:lsdException w:unhideWhenUsed="0" w:uiPriority="73" w:semiHidden="0" w:name="Colorful Grid Accent 2"/>
+    <w:lsdException w:unhideWhenUsed="0" w:uiPriority="60" w:semiHidden="0" w:name="Light Shading Accent 3"/>
+    <w:lsdException w:unhideWhenUsed="0" w:uiPriority="61" w:semiHidden="0" w:name="Light List Accent 3"/>
+    <w:lsdException w:unhideWhenUsed="0" w:uiPriority="62" w:semiHidden="0" w:name="Light Grid Accent 3"/>
+    <w:lsdException w:unhideWhenUsed="0" w:uiPriority="63" w:semiHidden="0" w:name="Medium Shading 1 Accent 3"/>
+    <w:lsdException w:unhideWhenUsed="0" w:uiPriority="64" w:semiHidden="0" w:name="Medium Shading 2 Accent 3"/>
+    <w:lsdException w:unhideWhenUsed="0" w:uiPriority="65" w:semiHidden="0" w:name="Medium List 1 Accent 3"/>
+    <w:lsdException w:unhideWhenUsed="0" w:uiPriority="66" w:semiHidden="0" w:name="Medium List 2 Accent 3"/>
+    <w:lsdException w:unhideWhenUsed="0" w:uiPriority="67" w:semiHidden="0" w:name="Medium Grid 1 Accent 3"/>
+    <w:lsdException w:unhideWhenUsed="0" w:uiPriority="68" w:semiHidden="0" w:name="Medium Grid 2 Accent 3"/>
+    <w:lsdException w:unhideWhenUsed="0" w:uiPriority="69" w:semiHidden="0" w:name="Medium Grid 3 Accent 3"/>
+    <w:lsdException w:unhideWhenUsed="0" w:uiPriority="70" w:semiHidden="0" w:name="Dark List Accent 3"/>
+    <w:lsdException w:unhideWhenUsed="0" w:uiPriority="71" w:semiHidden="0" w:name="Colorful Shading Accent 3"/>
+    <w:lsdException w:unhideWhenUsed="0" w:uiPriority="72" w:semiHidden="0" w:name="Colorful List Accent 3"/>
+    <w:lsdException w:unhideWhenUsed="0" w:uiPriority="73" w:semiHidden="0" w:name="Colorful Grid Accent 3"/>
+    <w:lsdException w:unhideWhenUsed="0" w:uiPriority="60" w:semiHidden="0" w:name="Light Shading Accent 4"/>
+    <w:lsdException w:unhideWhenUsed="0" w:uiPriority="61" w:semiHidden="0" w:name="Light List Accent 4"/>
+    <w:lsdException w:unhideWhenUsed="0" w:uiPriority="62" w:semiHidden="0" w:name="Light Grid Accent 4"/>
+    <w:lsdException w:unhideWhenUsed="0" w:uiPriority="63" w:semiHidden="0" w:name="Medium Shading 1 Accent 4"/>
+    <w:lsdException w:unhideWhenUsed="0" w:uiPriority="64" w:semiHidden="0" w:name="Medium Shading 2 Accent 4"/>
+    <w:lsdException w:unhideWhenUsed="0" w:uiPriority="65" w:semiHidden="0" w:name="Medium List 1 Accent 4"/>
+    <w:lsdException w:unhideWhenUsed="0" w:uiPriority="66" w:semiHidden="0" w:name="Medium List 2 Accent 4"/>
+    <w:lsdException w:unhideWhenUsed="0" w:uiPriority="67" w:semiHidden="0" w:name="Medium Grid 1 Accent 4"/>
+    <w:lsdException w:unhideWhenUsed="0" w:uiPriority="68" w:semiHidden="0" w:name="Medium Grid 2 Accent 4"/>
+    <w:lsdException w:unhideWhenUsed="0" w:uiPriority="69" w:semiHidden="0" w:name="Medium Grid 3 Accent 4"/>
+    <w:lsdException w:unhideWhenUsed="0" w:uiPriority="70" w:semiHidden="0" w:name="Dark List Accent 4"/>
+    <w:lsdException w:unhideWhenUsed="0" w:uiPriority="71" w:semiHidden="0" w:name="Colorful Shading Accent 4"/>
+    <w:lsdException w:unhideWhenUsed="0" w:uiPriority="72" w:semiHidden="0" w:name="Colorful List Accent 4"/>
+    <w:lsdException w:unhideWhenUsed="0" w:uiPriority="73" w:semiHidden="0" w:name="Colorful Grid Accent 4"/>
+    <w:lsdException w:unhideWhenUsed="0" w:uiPriority="60" w:semiHidden="0" w:name="Light Shading Accent 5"/>
+    <w:lsdException w:unhideWhenUsed="0" w:uiPriority="61" w:semiHidden="0" w:name="Light List Accent 5"/>
+    <w:lsdException w:unhideWhenUsed="0" w:uiPriority="62" w:semiHidden="0" w:name="Light Grid Accent 5"/>
+    <w:lsdException w:unhideWhenUsed="0" w:uiPriority="63" w:semiHidden="0" w:name="Medium Shading 1 Accent 5"/>
+    <w:lsdException w:unhideWhenUsed="0" w:uiPriority="64" w:semiHidden="0" w:name="Medium Shading 2 Accent 5"/>
+    <w:lsdException w:unhideWhenUsed="0" w:uiPriority="65" w:semiHidden="0" w:name="Medium List 1 Accent 5"/>
+    <w:lsdException w:unhideWhenUsed="0" w:uiPriority="66" w:semiHidden="0" w:name="Medium List 2 Accent 5"/>
+    <w:lsdException w:unhideWhenUsed="0" w:uiPriority="67" w:semiHidden="0" w:name="Medium Grid 1 Accent 5"/>
+    <w:lsdException w:unhideWhenUsed="0" w:uiPriority="68" w:semiHidden="0" w:name="Medium Grid 2 Accent 5"/>
+    <w:lsdException w:unhideWhenUsed="0" w:uiPriority="69" w:semiHidden="0" w:name="Medium Grid 3 Accent 5"/>
+    <w:lsdException w:unhideWhenUsed="0" w:uiPriority="70" w:semiHidden="0" w:name="Dark List Accent 5"/>
+    <w:lsdException w:unhideWhenUsed="0" w:uiPriority="71" w:semiHidden="0" w:name="Colorful Shading Accent 5"/>
+    <w:lsdException w:unhideWhenUsed="0" w:uiPriority="72" w:semiHidden="0" w:name="Colorful List Accent 5"/>
+    <w:lsdException w:unhideWhenUsed="0" w:uiPriority="73" w:semiHidden="0" w:name="Colorful Grid Accent 5"/>
+    <w:lsdException w:unhideWhenUsed="0" w:uiPriority="60" w:semiHidden="0" w:name="Light Shading Accent 6"/>
+    <w:lsdException w:unhideWhenUsed="0" w:uiPriority="61" w:semiHidden="0" w:name="Light List Accent 6"/>
+    <w:lsdException w:unhideWhenUsed="0" w:uiPriority="62" w:semiHidden="0" w:name="Light Grid Accent 6"/>
+    <w:lsdException w:unhideWhenUsed="0" w:uiPriority="63" w:semiHidden="0" w:name="Medium Shading 1 Accent 6"/>
+    <w:lsdException w:unhideWhenUsed="0" w:uiPriority="64" w:semiHidden="0" w:name="Medium Shading 2 Accent 6"/>
+    <w:lsdException w:unhideWhenUsed="0" w:uiPriority="65" w:semiHidden="0" w:name="Medium List 1 Accent 6"/>
+    <w:lsdException w:unhideWhenUsed="0" w:uiPriority="66" w:semiHidden="0" w:name="Medium List 2 Accent 6"/>
+    <w:lsdException w:unhideWhenUsed="0" w:uiPriority="67" w:semiHidden="0" w:name="Medium Grid 1 Accent 6"/>
+    <w:lsdException w:unhideWhenUsed="0" w:uiPriority="68" w:semiHidden="0" w:name="Medium Grid 2 Accent 6"/>
+    <w:lsdException w:unhideWhenUsed="0" w:uiPriority="69" w:semiHidden="0" w:name="Medium Grid 3 Accent 6"/>
+    <w:lsdException w:unhideWhenUsed="0" w:uiPriority="70" w:semiHidden="0" w:name="Dark List Accent 6"/>
+    <w:lsdException w:unhideWhenUsed="0" w:uiPriority="71" w:semiHidden="0" w:name="Colorful Shading Accent 6"/>
+    <w:lsdException w:unhideWhenUsed="0" w:uiPriority="72" w:semiHidden="0" w:name="Colorful List Accent 6"/>
+    <w:lsdException w:unhideWhenUsed="0" w:uiPriority="73" w:semiHidden="0" w:name="Colorful Grid Accent 6"/>
   </w:latentStyles>
-  <w:style xmlns:mc="http://schemas.openxmlformats.org/markup-compatibility/2006" xmlns:o="urn:schemas-microsoft-com:office:office" xmlns:r="http://schemas.openxmlformats.org/officeDocument/2006/relationships" xmlns:m="http://schemas.openxmlformats.org/officeDocument/2006/math" xmlns:v="urn:schemas-microsoft-com:vml" xmlns:w="http://schemas.openxmlformats.org/wordprocessingml/2006/main" xmlns:w14="http://schemas.microsoft.com/office/word/2010/wordml" xmlns:w10="urn:schemas-microsoft-com:office:word" xmlns:sl="http://schemas.openxmlformats.org/schemaLibrary/2006/main" xmlns:wpsCustomData="http://www.wps.cn/officeDocument/2013/wpsCustomData" w:type="paragraph" w:styleId="1" w:default="1">
+  <w:style w:type="paragraph" w:default="1" w:styleId="1">
     <w:name w:val="Normal"/>
     <w:qFormat/>
+    <w:uiPriority w:val="0"/>
     <w:pPr>
       <w:wordWrap/>
       <w:spacing w:after="80" w:line="288" w:lineRule="auto"/>
     </w:pPr>
     <w:rPr>
-      <w:rFonts w:ascii="微软雅黑" w:hAnsi="微软雅黑" w:eastAsia="微软雅黑"/>
+      <w:rFonts w:ascii="微软雅黑" w:hAnsi="微软雅黑" w:eastAsia="微软雅黑" w:cstheme="minorBidi"/>
       <w:sz w:val="21"/>
       <w:szCs w:val="22"/>
     </w:rPr>
   </w:style>
-  <w:style xmlns:mc="http://schemas.openxmlformats.org/markup-compatibility/2006" xmlns:o="urn:schemas-microsoft-com:office:office" xmlns:r="http://schemas.openxmlformats.org/officeDocument/2006/relationships" xmlns:m="http://schemas.openxmlformats.org/officeDocument/2006/math" xmlns:v="urn:schemas-microsoft-com:vml" xmlns:w="http://schemas.openxmlformats.org/wordprocessingml/2006/main" xmlns:w14="http://schemas.microsoft.com/office/word/2010/wordml" xmlns:w10="urn:schemas-microsoft-com:office:word" xmlns:sl="http://schemas.openxmlformats.org/schemaLibrary/2006/main" xmlns:wpsCustomData="http://www.wps.cn/officeDocument/2013/wpsCustomData" w:type="paragraph" w:styleId="2">
+  <w:style w:type="paragraph" w:styleId="2">
     <w:name w:val="heading 1"/>
     <w:basedOn w:val="1"/>
     <w:next w:val="1"/>
     <w:qFormat/>
+    <w:uiPriority w:val="0"/>
     <w:pPr>
       <w:keepNext/>
       <w:spacing w:before="360" w:after="160"/>
@@ -4390,11 +4880,12 @@
       <w:sz w:val="36"/>
     </w:rPr>
   </w:style>
-  <w:style xmlns:mc="http://schemas.openxmlformats.org/markup-compatibility/2006" xmlns:o="urn:schemas-microsoft-com:office:office" xmlns:r="http://schemas.openxmlformats.org/officeDocument/2006/relationships" xmlns:m="http://schemas.openxmlformats.org/officeDocument/2006/math" xmlns:v="urn:schemas-microsoft-com:vml" xmlns:w="http://schemas.openxmlformats.org/wordprocessingml/2006/main" xmlns:w14="http://schemas.microsoft.com/office/word/2010/wordml" xmlns:w10="urn:schemas-microsoft-com:office:word" xmlns:sl="http://schemas.openxmlformats.org/schemaLibrary/2006/main" xmlns:wpsCustomData="http://www.wps.cn/officeDocument/2013/wpsCustomData" w:type="paragraph" w:styleId="3">
+  <w:style w:type="paragraph" w:styleId="3">
     <w:name w:val="heading 2"/>
     <w:basedOn w:val="1"/>
     <w:next w:val="1"/>
     <w:qFormat/>
+    <w:uiPriority w:val="0"/>
     <w:pPr>
       <w:keepNext/>
       <w:spacing w:before="240" w:after="120"/>
@@ -4407,11 +4898,12 @@
       <w:sz w:val="28"/>
     </w:rPr>
   </w:style>
-  <w:style xmlns:mc="http://schemas.openxmlformats.org/markup-compatibility/2006" xmlns:o="urn:schemas-microsoft-com:office:office" xmlns:r="http://schemas.openxmlformats.org/officeDocument/2006/relationships" xmlns:m="http://schemas.openxmlformats.org/officeDocument/2006/math" xmlns:v="urn:schemas-microsoft-com:vml" xmlns:w="http://schemas.openxmlformats.org/wordprocessingml/2006/main" xmlns:w14="http://schemas.microsoft.com/office/word/2010/wordml" xmlns:w10="urn:schemas-microsoft-com:office:word" xmlns:sl="http://schemas.openxmlformats.org/schemaLibrary/2006/main" xmlns:wpsCustomData="http://www.wps.cn/officeDocument/2013/wpsCustomData" w:type="paragraph" w:styleId="4">
+  <w:style w:type="paragraph" w:styleId="4">
     <w:name w:val="heading 3"/>
     <w:basedOn w:val="1"/>
     <w:next w:val="1"/>
     <w:qFormat/>
+    <w:uiPriority w:val="0"/>
     <w:pPr>
       <w:keepNext/>
       <w:spacing w:before="160" w:after="80"/>
@@ -4424,13 +4916,16 @@
       <w:sz w:val="23"/>
     </w:rPr>
   </w:style>
-  <w:style xmlns:mc="http://schemas.openxmlformats.org/markup-compatibility/2006" xmlns:o="urn:schemas-microsoft-com:office:office" xmlns:r="http://schemas.openxmlformats.org/officeDocument/2006/relationships" xmlns:m="http://schemas.openxmlformats.org/officeDocument/2006/math" xmlns:v="urn:schemas-microsoft-com:vml" xmlns:w="http://schemas.openxmlformats.org/wordprocessingml/2006/main" xmlns:w14="http://schemas.microsoft.com/office/word/2010/wordml" xmlns:w10="urn:schemas-microsoft-com:office:word" xmlns:sl="http://schemas.openxmlformats.org/schemaLibrary/2006/main" xmlns:wpsCustomData="http://www.wps.cn/officeDocument/2013/wpsCustomData" w:type="character" w:styleId="6" w:default="1">
+  <w:style w:type="character" w:default="1" w:styleId="6">
     <w:name w:val="Default Paragraph Font"/>
     <w:semiHidden/>
+    <w:uiPriority w:val="0"/>
   </w:style>
-  <w:style xmlns:mc="http://schemas.openxmlformats.org/markup-compatibility/2006" xmlns:o="urn:schemas-microsoft-com:office:office" xmlns:r="http://schemas.openxmlformats.org/officeDocument/2006/relationships" xmlns:m="http://schemas.openxmlformats.org/officeDocument/2006/math" xmlns:v="urn:schemas-microsoft-com:vml" xmlns:w="http://schemas.openxmlformats.org/wordprocessingml/2006/main" xmlns:w14="http://schemas.microsoft.com/office/word/2010/wordml" xmlns:w10="urn:schemas-microsoft-com:office:word" xmlns:sl="http://schemas.openxmlformats.org/schemaLibrary/2006/main" xmlns:wpsCustomData="http://www.wps.cn/officeDocument/2013/wpsCustomData" w:type="table" w:styleId="5" w:default="1">
+  <w:style w:type="table" w:default="1" w:styleId="5">
     <w:name w:val="Normal Table"/>
     <w:semiHidden/>
+    <w:qFormat/>
+    <w:uiPriority w:val="0"/>
     <w:tblPr>
       <w:tblCellMar>
         <w:top w:w="0" w:type="dxa"/>

</xml_diff>